<commit_message>
Update app: auto-open folder, warranty wording fix, clear form button, and blank field formatting
</commit_message>
<xml_diff>
--- a/template_fiz.docx
+++ b/template_fiz.docx
@@ -102,25 +102,7 @@
           <w:sz w:val="20"/>
           <w:szCs w:val="20"/>
         </w:rPr>
-        <w:t>{{</w:t>
-      </w:r>
-      <w:proofErr w:type="spellStart"/>
-      <w:r>
-        <w:rPr>
-          <w:rFonts w:ascii="Times New Roman" w:hAnsi="Times New Roman" w:cs="Times New Roman"/>
-          <w:sz w:val="20"/>
-          <w:szCs w:val="20"/>
-        </w:rPr>
-        <w:t>contract_date</w:t>
-      </w:r>
-      <w:proofErr w:type="spellEnd"/>
-      <w:r>
-        <w:rPr>
-          <w:rFonts w:ascii="Times New Roman" w:hAnsi="Times New Roman" w:cs="Times New Roman"/>
-          <w:sz w:val="20"/>
-          <w:szCs w:val="20"/>
-        </w:rPr>
-        <w:t>}}</w:t>
+        <w:t>{{contract_date}}</w:t>
       </w:r>
     </w:p>
     <w:p>
@@ -139,18 +121,8 @@
           <w:sz w:val="20"/>
           <w:szCs w:val="20"/>
         </w:rPr>
-        <w:t xml:space="preserve">        Торговая </w:t>
-      </w:r>
-      <w:proofErr w:type="gramStart"/>
-      <w:r>
-        <w:rPr>
-          <w:color w:val="000000" w:themeColor="text1"/>
-          <w:sz w:val="20"/>
-          <w:szCs w:val="20"/>
-        </w:rPr>
-        <w:t>компания  «</w:t>
-      </w:r>
-      <w:proofErr w:type="gramEnd"/>
+        <w:t xml:space="preserve">        Торговая компания  «</w:t>
+      </w:r>
       <w:r>
         <w:rPr>
           <w:color w:val="000000" w:themeColor="text1"/>
@@ -342,23 +314,7 @@
           <w:sz w:val="20"/>
           <w:szCs w:val="20"/>
         </w:rPr>
-        <w:t>{{</w:t>
-      </w:r>
-      <w:proofErr w:type="spellStart"/>
-      <w:r>
-        <w:rPr>
-          <w:sz w:val="20"/>
-          <w:szCs w:val="20"/>
-        </w:rPr>
-        <w:t>fio</w:t>
-      </w:r>
-      <w:proofErr w:type="spellEnd"/>
-      <w:r>
-        <w:rPr>
-          <w:sz w:val="20"/>
-          <w:szCs w:val="20"/>
-        </w:rPr>
-        <w:t xml:space="preserve">}} </w:t>
+        <w:t xml:space="preserve">{{fio}} </w:t>
       </w:r>
       <w:r>
         <w:rPr>
@@ -435,18 +391,59 @@
           <w:sz w:val="20"/>
           <w:szCs w:val="20"/>
         </w:rPr>
+        <w:t>{{engine_model}}</w:t>
+      </w:r>
+      <w:bookmarkEnd w:id="1"/>
+      <w:r>
+        <w:rPr>
+          <w:rFonts w:ascii="Times New Roman" w:hAnsi="Times New Roman" w:cs="Times New Roman"/>
+          <w:sz w:val="20"/>
+          <w:szCs w:val="20"/>
+        </w:rPr>
+        <w:t xml:space="preserve"> номер</w:t>
+      </w:r>
+      <w:r>
+        <w:rPr>
+          <w:rFonts w:ascii="Times New Roman" w:hAnsi="Times New Roman" w:cs="Times New Roman"/>
+          <w:sz w:val="20"/>
+          <w:szCs w:val="20"/>
+        </w:rPr>
+        <w:t xml:space="preserve"> </w:t>
+      </w:r>
+      <w:r>
+        <w:rPr>
+          <w:rFonts w:ascii="Times New Roman" w:hAnsi="Times New Roman" w:cs="Times New Roman"/>
+          <w:sz w:val="20"/>
+          <w:szCs w:val="20"/>
+        </w:rPr>
         <w:t>{{</w:t>
       </w:r>
-      <w:proofErr w:type="spellStart"/>
-      <w:r>
-        <w:rPr>
-          <w:rFonts w:ascii="Times New Roman" w:hAnsi="Times New Roman" w:cs="Times New Roman"/>
-          <w:sz w:val="20"/>
-          <w:szCs w:val="20"/>
-        </w:rPr>
-        <w:t>engine_model</w:t>
-      </w:r>
-      <w:proofErr w:type="spellEnd"/>
+      <w:r>
+        <w:rPr>
+          <w:rFonts w:ascii="Times New Roman" w:hAnsi="Times New Roman" w:cs="Times New Roman"/>
+          <w:sz w:val="20"/>
+          <w:szCs w:val="20"/>
+          <w:lang w:val="en-US"/>
+        </w:rPr>
+        <w:t>engine</w:t>
+      </w:r>
+      <w:r>
+        <w:rPr>
+          <w:rFonts w:ascii="Times New Roman" w:hAnsi="Times New Roman" w:cs="Times New Roman"/>
+          <w:sz w:val="20"/>
+          <w:szCs w:val="20"/>
+        </w:rPr>
+        <w:t>_</w:t>
+      </w:r>
+      <w:r>
+        <w:rPr>
+          <w:rFonts w:ascii="Times New Roman" w:hAnsi="Times New Roman" w:cs="Times New Roman"/>
+          <w:sz w:val="20"/>
+          <w:szCs w:val="20"/>
+          <w:lang w:val="en-US"/>
+        </w:rPr>
+        <w:t>num</w:t>
+      </w:r>
       <w:r>
         <w:rPr>
           <w:rFonts w:ascii="Times New Roman" w:hAnsi="Times New Roman" w:cs="Times New Roman"/>
@@ -455,65 +452,6 @@
         </w:rPr>
         <w:t>}}</w:t>
       </w:r>
-      <w:bookmarkEnd w:id="1"/>
-      <w:r>
-        <w:rPr>
-          <w:rFonts w:ascii="Times New Roman" w:hAnsi="Times New Roman" w:cs="Times New Roman"/>
-          <w:sz w:val="20"/>
-          <w:szCs w:val="20"/>
-        </w:rPr>
-        <w:t xml:space="preserve"> номер</w:t>
-      </w:r>
-      <w:r>
-        <w:rPr>
-          <w:rFonts w:ascii="Times New Roman" w:hAnsi="Times New Roman" w:cs="Times New Roman"/>
-          <w:sz w:val="20"/>
-          <w:szCs w:val="20"/>
-        </w:rPr>
-        <w:t xml:space="preserve"> </w:t>
-      </w:r>
-      <w:r>
-        <w:rPr>
-          <w:rFonts w:ascii="Times New Roman" w:hAnsi="Times New Roman" w:cs="Times New Roman"/>
-          <w:sz w:val="20"/>
-          <w:szCs w:val="20"/>
-        </w:rPr>
-        <w:t>{{</w:t>
-      </w:r>
-      <w:r>
-        <w:rPr>
-          <w:rFonts w:ascii="Times New Roman" w:hAnsi="Times New Roman" w:cs="Times New Roman"/>
-          <w:sz w:val="20"/>
-          <w:szCs w:val="20"/>
-          <w:lang w:val="en-US"/>
-        </w:rPr>
-        <w:t>engine</w:t>
-      </w:r>
-      <w:r>
-        <w:rPr>
-          <w:rFonts w:ascii="Times New Roman" w:hAnsi="Times New Roman" w:cs="Times New Roman"/>
-          <w:sz w:val="20"/>
-          <w:szCs w:val="20"/>
-        </w:rPr>
-        <w:t>_</w:t>
-      </w:r>
-      <w:r>
-        <w:rPr>
-          <w:rFonts w:ascii="Times New Roman" w:hAnsi="Times New Roman" w:cs="Times New Roman"/>
-          <w:sz w:val="20"/>
-          <w:szCs w:val="20"/>
-          <w:lang w:val="en-US"/>
-        </w:rPr>
-        <w:t>num</w:t>
-      </w:r>
-      <w:r>
-        <w:rPr>
-          <w:rFonts w:ascii="Times New Roman" w:hAnsi="Times New Roman" w:cs="Times New Roman"/>
-          <w:sz w:val="20"/>
-          <w:szCs w:val="20"/>
-        </w:rPr>
-        <w:t>}}</w:t>
-      </w:r>
       <w:r>
         <w:rPr>
           <w:rFonts w:ascii="Times New Roman" w:hAnsi="Times New Roman" w:cs="Times New Roman"/>
@@ -555,27 +493,7 @@
           <w:sz w:val="20"/>
           <w:szCs w:val="20"/>
         </w:rPr>
-        <w:t>{{</w:t>
-      </w:r>
-      <w:proofErr w:type="spellStart"/>
-      <w:r>
-        <w:rPr>
-          <w:rFonts w:ascii="Times New Roman" w:hAnsi="Times New Roman" w:cs="Times New Roman"/>
-          <w:color w:val="000000" w:themeColor="text1"/>
-          <w:sz w:val="20"/>
-          <w:szCs w:val="20"/>
-        </w:rPr>
-        <w:t>car_brand</w:t>
-      </w:r>
-      <w:proofErr w:type="spellEnd"/>
-      <w:r>
-        <w:rPr>
-          <w:rFonts w:ascii="Times New Roman" w:hAnsi="Times New Roman" w:cs="Times New Roman"/>
-          <w:color w:val="000000" w:themeColor="text1"/>
-          <w:sz w:val="20"/>
-          <w:szCs w:val="20"/>
-        </w:rPr>
-        <w:t>}}</w:t>
+        <w:t>{{car_brand}}</w:t>
       </w:r>
       <w:r>
         <w:rPr>
@@ -593,27 +511,7 @@
           <w:sz w:val="20"/>
           <w:szCs w:val="20"/>
         </w:rPr>
-        <w:t>{{</w:t>
-      </w:r>
-      <w:proofErr w:type="spellStart"/>
-      <w:r>
-        <w:rPr>
-          <w:rFonts w:ascii="Times New Roman" w:hAnsi="Times New Roman" w:cs="Times New Roman"/>
-          <w:color w:val="000000" w:themeColor="text1"/>
-          <w:sz w:val="20"/>
-          <w:szCs w:val="20"/>
-        </w:rPr>
-        <w:t>car_model</w:t>
-      </w:r>
-      <w:proofErr w:type="spellEnd"/>
-      <w:r>
-        <w:rPr>
-          <w:rFonts w:ascii="Times New Roman" w:hAnsi="Times New Roman" w:cs="Times New Roman"/>
-          <w:color w:val="000000" w:themeColor="text1"/>
-          <w:sz w:val="20"/>
-          <w:szCs w:val="20"/>
-        </w:rPr>
-        <w:t>}}</w:t>
+        <w:t>{{car_model}}</w:t>
       </w:r>
       <w:r>
         <w:rPr>
@@ -631,27 +529,7 @@
           <w:sz w:val="20"/>
           <w:szCs w:val="20"/>
         </w:rPr>
-        <w:t>{{</w:t>
-      </w:r>
-      <w:proofErr w:type="spellStart"/>
-      <w:r>
-        <w:rPr>
-          <w:rFonts w:ascii="Times New Roman" w:hAnsi="Times New Roman" w:cs="Times New Roman"/>
-          <w:color w:val="000000" w:themeColor="text1"/>
-          <w:sz w:val="20"/>
-          <w:szCs w:val="20"/>
-        </w:rPr>
-        <w:t>car_gosnum</w:t>
-      </w:r>
-      <w:proofErr w:type="spellEnd"/>
-      <w:r>
-        <w:rPr>
-          <w:rFonts w:ascii="Times New Roman" w:hAnsi="Times New Roman" w:cs="Times New Roman"/>
-          <w:color w:val="000000" w:themeColor="text1"/>
-          <w:sz w:val="20"/>
-          <w:szCs w:val="20"/>
-        </w:rPr>
-        <w:t>}}</w:t>
+        <w:t>{{car_gosnum}}</w:t>
       </w:r>
     </w:p>
     <w:p>
@@ -1179,11 +1057,39 @@
     <w:p>
       <w:pPr>
         <w:spacing w:after="0" w:line="240" w:lineRule="auto"/>
-        <w:rPr>
-          <w:rFonts w:ascii="Times New Roman" w:hAnsi="Times New Roman" w:cs="Times New Roman"/>
-          <w:color w:val="000000" w:themeColor="text1"/>
-          <w:sz w:val="20"/>
-          <w:szCs w:val="20"/>
+        <w:jc w:val="center"/>
+        <w:rPr>
+          <w:rFonts w:ascii="Times New Roman" w:hAnsi="Times New Roman" w:cs="Times New Roman"/>
+          <w:b/>
+          <w:color w:val="000000" w:themeColor="text1"/>
+          <w:sz w:val="20"/>
+          <w:szCs w:val="20"/>
+          <w:u w:val="single"/>
+        </w:rPr>
+      </w:pPr>
+      <w:r>
+        <w:rPr>
+          <w:rFonts w:ascii="Times New Roman" w:hAnsi="Times New Roman" w:cs="Times New Roman"/>
+          <w:b/>
+          <w:color w:val="000000" w:themeColor="text1"/>
+          <w:sz w:val="20"/>
+          <w:szCs w:val="20"/>
+          <w:u w:val="single"/>
+        </w:rPr>
+        <w:t>3. Цена и порядок расчётов</w:t>
+      </w:r>
+    </w:p>
+    <w:p>
+      <w:pPr>
+        <w:spacing w:after="0" w:line="240" w:lineRule="auto"/>
+        <w:jc w:val="center"/>
+        <w:rPr>
+          <w:rFonts w:ascii="Times New Roman" w:hAnsi="Times New Roman" w:cs="Times New Roman"/>
+          <w:b/>
+          <w:color w:val="000000" w:themeColor="text1"/>
+          <w:sz w:val="20"/>
+          <w:szCs w:val="20"/>
+          <w:u w:val="single"/>
         </w:rPr>
       </w:pPr>
     </w:p>
@@ -1200,7 +1106,10 @@
           <w:u w:val="single"/>
         </w:rPr>
       </w:pPr>
-      <w:r>
+    </w:p>
+    <w:p>
+      <w:pPr>
+        <w:pStyle w:val="af3"/>
         <w:rPr>
           <w:rFonts w:ascii="Times New Roman" w:hAnsi="Times New Roman" w:cs="Times New Roman"/>
           <w:b/>
@@ -1209,20 +1118,794 @@
           <w:szCs w:val="20"/>
           <w:u w:val="single"/>
         </w:rPr>
-        <w:t>3. Цена и порядок расчётов</w:t>
-      </w:r>
+      </w:pPr>
+      <w:r>
+        <w:rPr>
+          <w:rFonts w:ascii="Times New Roman" w:hAnsi="Times New Roman" w:cs="Times New Roman"/>
+          <w:color w:val="000000" w:themeColor="text1"/>
+          <w:sz w:val="20"/>
+          <w:szCs w:val="20"/>
+        </w:rPr>
+        <w:t xml:space="preserve">3.1. Согласно условиям  заключаемого   договора  стоимость  заявленного  двигателя  (номерного агрегата)  составляет </w:t>
+      </w:r>
+      <w:r>
+        <w:rPr>
+          <w:rFonts w:ascii="Times New Roman" w:hAnsi="Times New Roman" w:cs="Times New Roman"/>
+          <w:color w:val="000000" w:themeColor="text1"/>
+          <w:sz w:val="20"/>
+          <w:szCs w:val="20"/>
+        </w:rPr>
+        <w:t xml:space="preserve">{{price}} </w:t>
+      </w:r>
+      <w:r>
+        <w:rPr>
+          <w:rFonts w:ascii="Times New Roman" w:hAnsi="Times New Roman" w:cs="Times New Roman"/>
+          <w:color w:val="000000" w:themeColor="text1"/>
+          <w:sz w:val="20"/>
+          <w:szCs w:val="20"/>
+        </w:rPr>
+        <w:t>(</w:t>
+      </w:r>
+      <w:r>
+        <w:rPr>
+          <w:rFonts w:ascii="Times New Roman" w:hAnsi="Times New Roman" w:cs="Times New Roman"/>
+          <w:color w:val="000000" w:themeColor="text1"/>
+          <w:sz w:val="20"/>
+          <w:szCs w:val="20"/>
+        </w:rPr>
+        <w:t>{{price_words}}</w:t>
+      </w:r>
+      <w:r>
+        <w:rPr>
+          <w:rFonts w:ascii="Times New Roman" w:hAnsi="Times New Roman" w:cs="Times New Roman"/>
+          <w:color w:val="000000" w:themeColor="text1"/>
+          <w:sz w:val="20"/>
+          <w:szCs w:val="20"/>
+        </w:rPr>
+        <w:t>) рублей.</w:t>
+      </w:r>
+      <w:r>
+        <w:rPr>
+          <w:rFonts w:ascii="Times New Roman" w:hAnsi="Times New Roman" w:cs="Times New Roman"/>
+          <w:color w:val="000000" w:themeColor="text1"/>
+          <w:sz w:val="20"/>
+          <w:szCs w:val="20"/>
+        </w:rPr>
+        <w:br/>
+        <w:t xml:space="preserve">3.2. Покупатель оплачивает поставленный Продавцом Товар по </w:t>
+      </w:r>
+      <w:r>
+        <w:rPr>
+          <w:rFonts w:ascii="Times New Roman" w:hAnsi="Times New Roman" w:cs="Times New Roman"/>
+          <w:color w:val="000000" w:themeColor="text1"/>
+          <w:sz w:val="20"/>
+          <w:szCs w:val="20"/>
+        </w:rPr>
+        <w:t>цене</w:t>
+      </w:r>
+      <w:r>
+        <w:rPr>
+          <w:rFonts w:ascii="Times New Roman" w:hAnsi="Times New Roman" w:cs="Times New Roman"/>
+          <w:color w:val="000000" w:themeColor="text1"/>
+          <w:sz w:val="20"/>
+          <w:szCs w:val="20"/>
+        </w:rPr>
+        <w:t xml:space="preserve">, </w:t>
+      </w:r>
+      <w:r>
+        <w:rPr>
+          <w:rFonts w:ascii="Times New Roman" w:hAnsi="Times New Roman" w:cs="Times New Roman"/>
+          <w:color w:val="000000" w:themeColor="text1"/>
+          <w:sz w:val="20"/>
+          <w:szCs w:val="20"/>
+        </w:rPr>
+        <w:t xml:space="preserve">указанной </w:t>
+      </w:r>
+      <w:r>
+        <w:rPr>
+          <w:rFonts w:ascii="Times New Roman" w:hAnsi="Times New Roman" w:cs="Times New Roman"/>
+          <w:color w:val="000000" w:themeColor="text1"/>
+          <w:sz w:val="20"/>
+          <w:szCs w:val="20"/>
+        </w:rPr>
+        <w:t>в Спецификации, на данный Товар.</w:t>
+      </w:r>
+      <w:r>
+        <w:rPr>
+          <w:rFonts w:ascii="Times New Roman" w:hAnsi="Times New Roman" w:cs="Times New Roman"/>
+          <w:color w:val="000000" w:themeColor="text1"/>
+          <w:sz w:val="20"/>
+          <w:szCs w:val="20"/>
+        </w:rPr>
+        <w:br/>
+      </w:r>
+    </w:p>
+    <w:p>
+      <w:pPr>
+        <w:pStyle w:val="af3"/>
+        <w:jc w:val="center"/>
+        <w:rPr>
+          <w:rFonts w:ascii="Times New Roman" w:hAnsi="Times New Roman" w:cs="Times New Roman"/>
+          <w:b/>
+          <w:color w:val="000000" w:themeColor="text1"/>
+          <w:sz w:val="20"/>
+          <w:szCs w:val="20"/>
+          <w:u w:val="single"/>
+        </w:rPr>
+      </w:pPr>
+    </w:p>
+    <w:p>
+      <w:pPr>
+        <w:pStyle w:val="af3"/>
+        <w:jc w:val="center"/>
+        <w:rPr>
+          <w:rFonts w:ascii="Times New Roman" w:hAnsi="Times New Roman" w:cs="Times New Roman"/>
+          <w:color w:val="000000" w:themeColor="text1"/>
+          <w:sz w:val="20"/>
+          <w:szCs w:val="20"/>
+        </w:rPr>
+      </w:pPr>
+      <w:r>
+        <w:rPr>
+          <w:rFonts w:ascii="Times New Roman" w:hAnsi="Times New Roman" w:cs="Times New Roman"/>
+          <w:b/>
+          <w:color w:val="000000" w:themeColor="text1"/>
+          <w:sz w:val="20"/>
+          <w:szCs w:val="20"/>
+          <w:u w:val="single"/>
+        </w:rPr>
+        <w:lastRenderedPageBreak/>
+        <w:t>4. Гарантия</w:t>
+      </w:r>
+    </w:p>
+    <w:p>
+      <w:pPr>
+        <w:pStyle w:val="af3"/>
+        <w:jc w:val="center"/>
+        <w:rPr>
+          <w:rFonts w:ascii="Times New Roman" w:hAnsi="Times New Roman" w:cs="Times New Roman"/>
+          <w:b/>
+          <w:color w:val="000000" w:themeColor="text1"/>
+          <w:sz w:val="20"/>
+          <w:szCs w:val="20"/>
+          <w:u w:val="single"/>
+        </w:rPr>
+      </w:pPr>
     </w:p>
     <w:p>
       <w:pPr>
         <w:spacing w:after="0" w:line="240" w:lineRule="auto"/>
-        <w:jc w:val="center"/>
-        <w:rPr>
-          <w:rFonts w:ascii="Times New Roman" w:hAnsi="Times New Roman" w:cs="Times New Roman"/>
-          <w:b/>
-          <w:color w:val="000000" w:themeColor="text1"/>
-          <w:sz w:val="20"/>
-          <w:szCs w:val="20"/>
-          <w:u w:val="single"/>
+        <w:jc w:val="both"/>
+        <w:rPr>
+          <w:rFonts w:ascii="Times New Roman" w:hAnsi="Times New Roman" w:cs="Times New Roman"/>
+          <w:color w:val="000000" w:themeColor="text1"/>
+          <w:sz w:val="20"/>
+          <w:szCs w:val="20"/>
+        </w:rPr>
+      </w:pPr>
+      <w:r>
+        <w:rPr>
+          <w:rFonts w:ascii="Times New Roman" w:hAnsi="Times New Roman" w:cs="Times New Roman"/>
+          <w:color w:val="000000" w:themeColor="text1"/>
+          <w:sz w:val="20"/>
+          <w:szCs w:val="20"/>
+        </w:rPr>
+        <w:t xml:space="preserve">4.1. Гарантия предоставляется при условии правильной установки и эксплуатации агрегата. Регламентные работы по </w:t>
+      </w:r>
+      <w:r>
+        <w:rPr>
+          <w:rFonts w:ascii="Times New Roman" w:hAnsi="Times New Roman" w:cs="Times New Roman"/>
+          <w:color w:val="000000" w:themeColor="text1"/>
+          <w:sz w:val="20"/>
+          <w:szCs w:val="20"/>
+        </w:rPr>
+        <w:t>обслуживанию агрегата следует</w:t>
+      </w:r>
+      <w:r>
+        <w:rPr>
+          <w:rFonts w:ascii="Times New Roman" w:hAnsi="Times New Roman" w:cs="Times New Roman"/>
+          <w:color w:val="000000" w:themeColor="text1"/>
+          <w:sz w:val="20"/>
+          <w:szCs w:val="20"/>
+        </w:rPr>
+        <w:t xml:space="preserve">  производить в соответствии с требования указанными в сервисной книжке автомобиля, </w:t>
+      </w:r>
+    </w:p>
+    <w:p>
+      <w:pPr>
+        <w:spacing w:after="0" w:line="240" w:lineRule="auto"/>
+        <w:rPr>
+          <w:rFonts w:ascii="Times New Roman" w:hAnsi="Times New Roman" w:cs="Times New Roman"/>
+          <w:color w:val="000000" w:themeColor="text1"/>
+          <w:sz w:val="20"/>
+          <w:szCs w:val="20"/>
+        </w:rPr>
+      </w:pPr>
+      <w:r>
+        <w:rPr>
+          <w:rFonts w:ascii="Times New Roman" w:hAnsi="Times New Roman" w:cs="Times New Roman"/>
+          <w:color w:val="000000" w:themeColor="text1"/>
+          <w:sz w:val="20"/>
+          <w:szCs w:val="20"/>
+        </w:rPr>
+        <w:t>на который устанавливается агрегат в соответствии с пробегом.</w:t>
+      </w:r>
+      <w:r>
+        <w:rPr>
+          <w:rFonts w:ascii="Times New Roman" w:hAnsi="Times New Roman" w:cs="Times New Roman"/>
+          <w:color w:val="000000" w:themeColor="text1"/>
+          <w:sz w:val="20"/>
+          <w:szCs w:val="20"/>
+        </w:rPr>
+        <w:t xml:space="preserve"> </w:t>
+      </w:r>
+      <w:r>
+        <w:rPr>
+          <w:rFonts w:ascii="Times New Roman" w:hAnsi="Times New Roman" w:cs="Times New Roman"/>
+          <w:sz w:val="20"/>
+          <w:szCs w:val="20"/>
+        </w:rPr>
+        <w:t xml:space="preserve">Отсутствие отметок в сервисной книжке о прохождении </w:t>
+      </w:r>
+      <w:r>
+        <w:rPr>
+          <w:rFonts w:ascii="Times New Roman" w:hAnsi="Times New Roman" w:cs="Times New Roman"/>
+          <w:sz w:val="20"/>
+          <w:szCs w:val="20"/>
+        </w:rPr>
+        <w:t>обслуживания и проведения необходимых регламентных работ в соответствии с пробегом автомобиля считается нарушением правил эксплуатации агрегата</w:t>
+      </w:r>
+      <w:r>
+        <w:rPr>
+          <w:rFonts w:ascii="Times New Roman" w:hAnsi="Times New Roman" w:cs="Times New Roman"/>
+          <w:sz w:val="20"/>
+          <w:szCs w:val="20"/>
+        </w:rPr>
+        <w:t>.</w:t>
+      </w:r>
+      <w:r>
+        <w:rPr>
+          <w:rFonts w:ascii="Times New Roman" w:hAnsi="Times New Roman" w:cs="Times New Roman"/>
+          <w:sz w:val="20"/>
+          <w:szCs w:val="20"/>
+        </w:rPr>
+        <w:br/>
+      </w:r>
+      <w:r>
+        <w:rPr>
+          <w:rFonts w:ascii="Times New Roman" w:hAnsi="Times New Roman" w:cs="Times New Roman"/>
+          <w:color w:val="000000" w:themeColor="text1"/>
+          <w:sz w:val="20"/>
+          <w:szCs w:val="20"/>
+        </w:rPr>
+        <w:t>4.2. В целях предупреждения ухудшения качества работы узлов, выполнение работ по его установке следует проводить в условиях Автосервиса, имеющих ОКВЭД на осуществление данного вида деятельности.</w:t>
+      </w:r>
+    </w:p>
+    <w:p>
+      <w:pPr>
+        <w:spacing w:after="0" w:line="240" w:lineRule="auto"/>
+        <w:jc w:val="both"/>
+        <w:rPr>
+          <w:rFonts w:ascii="Times New Roman" w:hAnsi="Times New Roman" w:cs="Times New Roman"/>
+          <w:color w:val="000000" w:themeColor="text1"/>
+          <w:sz w:val="20"/>
+          <w:szCs w:val="20"/>
+        </w:rPr>
+      </w:pPr>
+      <w:r>
+        <w:rPr>
+          <w:rFonts w:ascii="Times New Roman" w:hAnsi="Times New Roman" w:cs="Times New Roman"/>
+          <w:color w:val="000000" w:themeColor="text1"/>
+          <w:sz w:val="20"/>
+          <w:szCs w:val="20"/>
+        </w:rPr>
+        <w:t xml:space="preserve">4.3. При соблюдении пункта 4.2. на приобретённые агрегаты устанавливается гарантийный срок на установку и проверку агрегата, сроком на </w:t>
+      </w:r>
+      <w:r>
+        <w:rPr>
+          <w:rFonts w:ascii="Times New Roman" w:hAnsi="Times New Roman" w:cs="Times New Roman"/>
+          <w:color w:val="000000" w:themeColor="text1"/>
+          <w:sz w:val="20"/>
+          <w:szCs w:val="20"/>
+        </w:rPr>
+        <w:t>{{warranty_months}}</w:t>
+      </w:r>
+      <w:r>
+        <w:rPr>
+          <w:rFonts w:ascii="Times New Roman" w:hAnsi="Times New Roman" w:cs="Times New Roman"/>
+          <w:color w:val="000000" w:themeColor="text1"/>
+          <w:sz w:val="20"/>
+          <w:szCs w:val="20"/>
+        </w:rPr>
+        <w:t xml:space="preserve"> </w:t>
+      </w:r>
+      <w:r>
+        <w:rPr>
+          <w:rFonts w:ascii="Times New Roman" w:hAnsi="Times New Roman" w:cs="Times New Roman"/>
+          <w:color w:val="000000" w:themeColor="text1"/>
+          <w:sz w:val="20"/>
+          <w:szCs w:val="20"/>
+        </w:rPr>
+        <w:t xml:space="preserve">или </w:t>
+      </w:r>
+      <w:r>
+        <w:rPr>
+          <w:rFonts w:ascii="Times New Roman" w:hAnsi="Times New Roman" w:cs="Times New Roman"/>
+          <w:color w:val="000000" w:themeColor="text1"/>
+          <w:sz w:val="20"/>
+          <w:szCs w:val="20"/>
+        </w:rPr>
+        <w:t>{{warranty_km}}</w:t>
+      </w:r>
+      <w:r>
+        <w:rPr>
+          <w:rFonts w:ascii="Times New Roman" w:hAnsi="Times New Roman" w:cs="Times New Roman"/>
+          <w:color w:val="000000" w:themeColor="text1"/>
+          <w:sz w:val="20"/>
+          <w:szCs w:val="20"/>
+        </w:rPr>
+        <w:t xml:space="preserve"> к</w:t>
+      </w:r>
+      <w:r>
+        <w:rPr>
+          <w:rFonts w:ascii="Times New Roman" w:hAnsi="Times New Roman" w:cs="Times New Roman"/>
+          <w:color w:val="000000" w:themeColor="text1"/>
+          <w:sz w:val="20"/>
+          <w:szCs w:val="20"/>
+        </w:rPr>
+        <w:t>илометров</w:t>
+      </w:r>
+      <w:r>
+        <w:rPr>
+          <w:rFonts w:ascii="Times New Roman" w:hAnsi="Times New Roman" w:cs="Times New Roman"/>
+          <w:color w:val="000000" w:themeColor="text1"/>
+          <w:sz w:val="20"/>
+          <w:szCs w:val="20"/>
+        </w:rPr>
+        <w:t xml:space="preserve"> пробега (что наступит раньше), </w:t>
+      </w:r>
+      <w:r>
+        <w:rPr>
+          <w:rFonts w:ascii="Times New Roman" w:hAnsi="Times New Roman" w:cs="Times New Roman"/>
+          <w:color w:val="000000" w:themeColor="text1"/>
+          <w:sz w:val="20"/>
+          <w:szCs w:val="20"/>
+        </w:rPr>
+        <w:t xml:space="preserve">с момента получения агрегата. </w:t>
+      </w:r>
+    </w:p>
+    <w:p>
+      <w:pPr>
+        <w:spacing w:after="0" w:line="240" w:lineRule="auto"/>
+        <w:jc w:val="both"/>
+        <w:rPr>
+          <w:rFonts w:ascii="Times New Roman" w:hAnsi="Times New Roman" w:cs="Times New Roman"/>
+          <w:color w:val="000000" w:themeColor="text1"/>
+          <w:sz w:val="20"/>
+          <w:szCs w:val="20"/>
+        </w:rPr>
+      </w:pPr>
+      <w:r>
+        <w:rPr>
+          <w:rFonts w:ascii="Times New Roman" w:hAnsi="Times New Roman" w:cs="Times New Roman"/>
+          <w:color w:val="000000" w:themeColor="text1"/>
+          <w:sz w:val="20"/>
+          <w:szCs w:val="20"/>
+        </w:rPr>
+        <w:t xml:space="preserve">4.4. При установке агрегата вне условий </w:t>
+      </w:r>
+      <w:r>
+        <w:rPr>
+          <w:rFonts w:ascii="Times New Roman" w:hAnsi="Times New Roman" w:cs="Times New Roman"/>
+          <w:sz w:val="20"/>
+          <w:szCs w:val="20"/>
+        </w:rPr>
+        <w:t>сертифицированного</w:t>
+      </w:r>
+      <w:r>
+        <w:rPr>
+          <w:rFonts w:ascii="Times New Roman" w:hAnsi="Times New Roman" w:cs="Times New Roman"/>
+          <w:color w:val="000000" w:themeColor="text1"/>
+          <w:sz w:val="20"/>
+          <w:szCs w:val="20"/>
+        </w:rPr>
+        <w:t xml:space="preserve"> </w:t>
+      </w:r>
+      <w:r>
+        <w:rPr>
+          <w:rFonts w:ascii="Times New Roman" w:hAnsi="Times New Roman" w:cs="Times New Roman"/>
+          <w:color w:val="000000" w:themeColor="text1"/>
+          <w:sz w:val="20"/>
+          <w:szCs w:val="20"/>
+        </w:rPr>
+        <w:t>Автосервиса, Продавец снимает с себя гарантийные обязательства.</w:t>
+      </w:r>
+    </w:p>
+    <w:p>
+      <w:pPr>
+        <w:spacing w:after="0" w:line="240" w:lineRule="auto"/>
+        <w:jc w:val="both"/>
+        <w:rPr>
+          <w:rFonts w:ascii="Times New Roman" w:hAnsi="Times New Roman" w:cs="Times New Roman"/>
+          <w:color w:val="000000" w:themeColor="text1"/>
+          <w:sz w:val="20"/>
+          <w:szCs w:val="20"/>
+        </w:rPr>
+      </w:pPr>
+      <w:r>
+        <w:rPr>
+          <w:rFonts w:ascii="Times New Roman" w:hAnsi="Times New Roman" w:cs="Times New Roman"/>
+          <w:color w:val="000000" w:themeColor="text1"/>
+          <w:sz w:val="20"/>
+          <w:szCs w:val="20"/>
+        </w:rPr>
+        <w:t>4.5. Претензии принимаются в течение гарантийного срока, при условии соблюдения требований по установке и эксплуатации агрегата.</w:t>
+      </w:r>
+    </w:p>
+    <w:p>
+      <w:pPr>
+        <w:spacing w:after="0" w:line="240" w:lineRule="auto"/>
+        <w:jc w:val="both"/>
+        <w:rPr>
+          <w:rFonts w:ascii="Times New Roman" w:hAnsi="Times New Roman" w:cs="Times New Roman"/>
+          <w:sz w:val="20"/>
+          <w:szCs w:val="20"/>
+        </w:rPr>
+      </w:pPr>
+      <w:r>
+        <w:rPr>
+          <w:rFonts w:ascii="Times New Roman" w:hAnsi="Times New Roman" w:cs="Times New Roman"/>
+          <w:color w:val="000000" w:themeColor="text1"/>
+          <w:sz w:val="20"/>
+          <w:szCs w:val="20"/>
+        </w:rPr>
+        <w:t xml:space="preserve">4.6. При возникновении сомнений в качестве ДВС, покупатель должен произвести замер компрессии и проверку иных </w:t>
+      </w:r>
+      <w:r>
+        <w:rPr>
+          <w:rFonts w:ascii="Times New Roman" w:hAnsi="Times New Roman" w:cs="Times New Roman"/>
+          <w:sz w:val="20"/>
+          <w:szCs w:val="20"/>
+        </w:rPr>
+        <w:t xml:space="preserve">характеристик ДВС, вызывающих подозрения о неисправности.  </w:t>
+      </w:r>
+    </w:p>
+    <w:p>
+      <w:pPr>
+        <w:spacing w:after="0" w:line="240" w:lineRule="auto"/>
+        <w:jc w:val="both"/>
+        <w:rPr>
+          <w:rFonts w:ascii="Times New Roman" w:hAnsi="Times New Roman" w:cs="Times New Roman"/>
+          <w:sz w:val="20"/>
+          <w:szCs w:val="20"/>
+        </w:rPr>
+      </w:pPr>
+      <w:r>
+        <w:rPr>
+          <w:rFonts w:ascii="Times New Roman" w:hAnsi="Times New Roman" w:cs="Times New Roman"/>
+          <w:sz w:val="20"/>
+          <w:szCs w:val="20"/>
+        </w:rPr>
+        <w:t>4.6.1. При выявлении неисправных деталей, в приобретенном у Продавца агрегате, в течение гарантийного срока</w:t>
+      </w:r>
+      <w:r>
+        <w:rPr>
+          <w:rFonts w:ascii="Times New Roman" w:hAnsi="Times New Roman" w:cs="Times New Roman"/>
+          <w:sz w:val="20"/>
+          <w:szCs w:val="20"/>
+        </w:rPr>
+        <w:t>,</w:t>
+      </w:r>
+      <w:r>
+        <w:rPr>
+          <w:rFonts w:ascii="Times New Roman" w:hAnsi="Times New Roman" w:cs="Times New Roman"/>
+          <w:sz w:val="20"/>
+          <w:szCs w:val="20"/>
+        </w:rPr>
+        <w:t xml:space="preserve"> в результате диагностики на сертифицированном  Автосервисе, Продавец проводит замену неисправных комплектующих агрегата, либо компенсирует Покупателю их стоимость</w:t>
+      </w:r>
+      <w:r>
+        <w:rPr>
+          <w:rFonts w:ascii="Times New Roman" w:hAnsi="Times New Roman" w:cs="Times New Roman"/>
+          <w:sz w:val="20"/>
+          <w:szCs w:val="20"/>
+        </w:rPr>
+        <w:t xml:space="preserve"> в разумный срок</w:t>
+      </w:r>
+      <w:r>
+        <w:rPr>
+          <w:rFonts w:ascii="Times New Roman" w:hAnsi="Times New Roman" w:cs="Times New Roman"/>
+          <w:sz w:val="20"/>
+          <w:szCs w:val="20"/>
+        </w:rPr>
+        <w:t xml:space="preserve">. Услуги по диагностике неисправности, </w:t>
+      </w:r>
+      <w:r>
+        <w:rPr>
+          <w:rFonts w:ascii="Times New Roman" w:hAnsi="Times New Roman" w:cs="Times New Roman"/>
+          <w:sz w:val="20"/>
+          <w:szCs w:val="20"/>
+        </w:rPr>
+        <w:t xml:space="preserve">работ по </w:t>
+      </w:r>
+      <w:r>
+        <w:rPr>
+          <w:rFonts w:ascii="Times New Roman" w:hAnsi="Times New Roman" w:cs="Times New Roman"/>
+          <w:sz w:val="20"/>
+          <w:szCs w:val="20"/>
+        </w:rPr>
+        <w:t xml:space="preserve">замене неисправных комплектующих Покупатель оплачивает самостоятельно. Продавец компенсацию стоимости этих услуг не производит. </w:t>
+      </w:r>
+    </w:p>
+    <w:p>
+      <w:pPr>
+        <w:spacing w:after="0" w:line="240" w:lineRule="auto"/>
+        <w:jc w:val="both"/>
+        <w:rPr>
+          <w:rFonts w:ascii="Times New Roman" w:hAnsi="Times New Roman" w:cs="Times New Roman"/>
+          <w:sz w:val="20"/>
+          <w:szCs w:val="20"/>
+        </w:rPr>
+      </w:pPr>
+      <w:r>
+        <w:rPr>
+          <w:rFonts w:ascii="Times New Roman" w:hAnsi="Times New Roman" w:cs="Times New Roman"/>
+          <w:sz w:val="20"/>
+          <w:szCs w:val="20"/>
+        </w:rPr>
+        <w:t xml:space="preserve"> </w:t>
+      </w:r>
+      <w:r>
+        <w:rPr>
+          <w:rFonts w:ascii="Times New Roman" w:hAnsi="Times New Roman" w:cs="Times New Roman"/>
+          <w:sz w:val="20"/>
+          <w:szCs w:val="20"/>
+        </w:rPr>
+        <w:t>4.7. Гарантия не распространяется:</w:t>
+      </w:r>
+    </w:p>
+    <w:p>
+      <w:pPr>
+        <w:spacing w:after="0" w:line="240" w:lineRule="auto"/>
+        <w:jc w:val="both"/>
+        <w:rPr>
+          <w:rFonts w:ascii="Times New Roman" w:hAnsi="Times New Roman" w:cs="Times New Roman"/>
+          <w:sz w:val="20"/>
+          <w:szCs w:val="20"/>
+        </w:rPr>
+      </w:pPr>
+      <w:r>
+        <w:rPr>
+          <w:rFonts w:ascii="Times New Roman" w:hAnsi="Times New Roman" w:cs="Times New Roman"/>
+          <w:sz w:val="20"/>
+          <w:szCs w:val="20"/>
+        </w:rPr>
+        <w:t>4.7.</w:t>
+      </w:r>
+      <w:r>
+        <w:rPr>
+          <w:rFonts w:ascii="Times New Roman" w:hAnsi="Times New Roman" w:cs="Times New Roman"/>
+          <w:sz w:val="20"/>
+          <w:szCs w:val="20"/>
+        </w:rPr>
+        <w:t>1. Если</w:t>
+      </w:r>
+      <w:r>
+        <w:rPr>
+          <w:rFonts w:ascii="Times New Roman" w:hAnsi="Times New Roman" w:cs="Times New Roman"/>
+          <w:sz w:val="20"/>
+          <w:szCs w:val="20"/>
+        </w:rPr>
+        <w:t xml:space="preserve"> агрегат получил механические повреждения по вине Покупателя.</w:t>
+      </w:r>
+    </w:p>
+    <w:p>
+      <w:pPr>
+        <w:spacing w:after="0" w:line="240" w:lineRule="auto"/>
+        <w:jc w:val="both"/>
+        <w:rPr>
+          <w:rFonts w:ascii="Times New Roman" w:hAnsi="Times New Roman" w:cs="Times New Roman"/>
+          <w:sz w:val="20"/>
+          <w:szCs w:val="20"/>
+        </w:rPr>
+      </w:pPr>
+      <w:r>
+        <w:rPr>
+          <w:rFonts w:ascii="Times New Roman" w:hAnsi="Times New Roman" w:cs="Times New Roman"/>
+          <w:sz w:val="20"/>
+          <w:szCs w:val="20"/>
+        </w:rPr>
+        <w:t>4.7.2. Если продавец несвоевременно извещён о наличии дефектов.</w:t>
+      </w:r>
+    </w:p>
+    <w:p>
+      <w:pPr>
+        <w:spacing w:after="0" w:line="240" w:lineRule="auto"/>
+        <w:jc w:val="both"/>
+        <w:rPr>
+          <w:rFonts w:ascii="Times New Roman" w:hAnsi="Times New Roman" w:cs="Times New Roman"/>
+          <w:color w:val="000000" w:themeColor="text1"/>
+          <w:sz w:val="20"/>
+          <w:szCs w:val="20"/>
+        </w:rPr>
+      </w:pPr>
+      <w:r>
+        <w:rPr>
+          <w:rFonts w:ascii="Times New Roman" w:hAnsi="Times New Roman" w:cs="Times New Roman"/>
+          <w:color w:val="000000" w:themeColor="text1"/>
+          <w:sz w:val="20"/>
+          <w:szCs w:val="20"/>
+        </w:rPr>
+        <w:t>4.7.3.</w:t>
+      </w:r>
+      <w:r>
+        <w:rPr>
+          <w:rFonts w:ascii="Times New Roman" w:hAnsi="Times New Roman" w:cs="Times New Roman"/>
+          <w:color w:val="000000" w:themeColor="text1"/>
+          <w:sz w:val="20"/>
+          <w:szCs w:val="20"/>
+        </w:rPr>
+        <w:t xml:space="preserve"> </w:t>
+      </w:r>
+      <w:r>
+        <w:rPr>
+          <w:rFonts w:ascii="Times New Roman" w:hAnsi="Times New Roman" w:cs="Times New Roman"/>
+          <w:color w:val="000000" w:themeColor="text1"/>
+          <w:sz w:val="20"/>
+          <w:szCs w:val="20"/>
+        </w:rPr>
+        <w:t xml:space="preserve">Если ДВС эксплуатируется на автомобиле с неисправной системой охлаждения двигателя,  или с несоответствующим данному двигателю маслом, или с уровнем масла ниже критической отметки. </w:t>
+      </w:r>
+    </w:p>
+    <w:p>
+      <w:pPr>
+        <w:spacing w:after="0" w:line="240" w:lineRule="auto"/>
+        <w:jc w:val="both"/>
+        <w:rPr>
+          <w:rFonts w:ascii="Times New Roman" w:hAnsi="Times New Roman" w:cs="Times New Roman"/>
+          <w:color w:val="000000" w:themeColor="text1"/>
+          <w:sz w:val="20"/>
+          <w:szCs w:val="20"/>
+        </w:rPr>
+      </w:pPr>
+      <w:r>
+        <w:rPr>
+          <w:rFonts w:ascii="Times New Roman" w:hAnsi="Times New Roman" w:cs="Times New Roman"/>
+          <w:color w:val="000000" w:themeColor="text1"/>
+          <w:sz w:val="20"/>
+          <w:szCs w:val="20"/>
+        </w:rPr>
+        <w:t>4.7.4. На сальники, маслосъёмные колпачки, прокладки поддона и клапанные крышки.</w:t>
+      </w:r>
+    </w:p>
+    <w:p>
+      <w:pPr>
+        <w:spacing w:after="0" w:line="240" w:lineRule="auto"/>
+        <w:jc w:val="both"/>
+        <w:rPr>
+          <w:rFonts w:ascii="Times New Roman" w:hAnsi="Times New Roman" w:cs="Times New Roman"/>
+          <w:color w:val="000000" w:themeColor="text1"/>
+          <w:sz w:val="20"/>
+          <w:szCs w:val="20"/>
+        </w:rPr>
+      </w:pPr>
+      <w:r>
+        <w:rPr>
+          <w:rFonts w:ascii="Times New Roman" w:hAnsi="Times New Roman" w:cs="Times New Roman"/>
+          <w:color w:val="000000" w:themeColor="text1"/>
+          <w:sz w:val="20"/>
+          <w:szCs w:val="20"/>
+        </w:rPr>
+        <w:t xml:space="preserve">4.7.5. В случае, если агрегат был разобран без согласования с Продавцом и нарушены метки. </w:t>
+      </w:r>
+    </w:p>
+    <w:p>
+      <w:pPr>
+        <w:spacing w:after="0" w:line="240" w:lineRule="auto"/>
+        <w:jc w:val="both"/>
+        <w:rPr>
+          <w:rFonts w:ascii="Times New Roman" w:hAnsi="Times New Roman" w:cs="Times New Roman"/>
+          <w:color w:val="000000" w:themeColor="text1"/>
+          <w:sz w:val="20"/>
+          <w:szCs w:val="20"/>
+        </w:rPr>
+      </w:pPr>
+      <w:r>
+        <w:rPr>
+          <w:rFonts w:ascii="Times New Roman" w:hAnsi="Times New Roman" w:cs="Times New Roman"/>
+          <w:color w:val="000000" w:themeColor="text1"/>
+          <w:sz w:val="20"/>
+          <w:szCs w:val="20"/>
+        </w:rPr>
+        <w:t>4.7.6. Если агрегат приобретён для установки на автомобиль, на который узел не устанавливался серийно, либо при изменении объёма двигателя или топлива. Ответственность за его конструктивную совместимость и эксплуатационные характеристики Покупатель берёт на себя.</w:t>
+      </w:r>
+    </w:p>
+    <w:p>
+      <w:pPr>
+        <w:spacing w:after="0" w:line="240" w:lineRule="auto"/>
+        <w:jc w:val="both"/>
+        <w:rPr>
+          <w:rFonts w:ascii="Times New Roman" w:hAnsi="Times New Roman" w:cs="Times New Roman"/>
+          <w:sz w:val="20"/>
+          <w:szCs w:val="20"/>
+        </w:rPr>
+      </w:pPr>
+      <w:r>
+        <w:rPr>
+          <w:rFonts w:ascii="Times New Roman" w:hAnsi="Times New Roman" w:cs="Times New Roman"/>
+          <w:sz w:val="20"/>
+          <w:szCs w:val="20"/>
+        </w:rPr>
+        <w:t xml:space="preserve">4.7.7. В случае если </w:t>
+      </w:r>
+      <w:r>
+        <w:rPr>
+          <w:rFonts w:ascii="Times New Roman" w:hAnsi="Times New Roman" w:cs="Times New Roman"/>
+          <w:sz w:val="20"/>
+          <w:szCs w:val="20"/>
+        </w:rPr>
+        <w:t>агрегат (</w:t>
+      </w:r>
+      <w:r>
+        <w:rPr>
+          <w:rFonts w:ascii="Times New Roman" w:hAnsi="Times New Roman" w:cs="Times New Roman"/>
+          <w:sz w:val="20"/>
+          <w:szCs w:val="20"/>
+        </w:rPr>
+        <w:t>двигатель</w:t>
+      </w:r>
+      <w:r>
+        <w:rPr>
+          <w:rFonts w:ascii="Times New Roman" w:hAnsi="Times New Roman" w:cs="Times New Roman"/>
+          <w:sz w:val="20"/>
+          <w:szCs w:val="20"/>
+        </w:rPr>
+        <w:t>)</w:t>
+      </w:r>
+      <w:r>
+        <w:rPr>
+          <w:rFonts w:ascii="Times New Roman" w:hAnsi="Times New Roman" w:cs="Times New Roman"/>
+          <w:sz w:val="20"/>
+          <w:szCs w:val="20"/>
+        </w:rPr>
+        <w:t xml:space="preserve"> </w:t>
+      </w:r>
+      <w:r>
+        <w:rPr>
+          <w:rFonts w:ascii="Times New Roman" w:hAnsi="Times New Roman" w:cs="Times New Roman"/>
+          <w:sz w:val="20"/>
+          <w:szCs w:val="20"/>
+        </w:rPr>
+        <w:t xml:space="preserve">на автомобиле работал на газомоторном топливе, либо бензине иной марки, чем рекомендовано производителем. </w:t>
+      </w:r>
+    </w:p>
+    <w:p>
+      <w:pPr>
+        <w:spacing w:after="0" w:line="240" w:lineRule="auto"/>
+        <w:jc w:val="both"/>
+        <w:rPr>
+          <w:rFonts w:ascii="Times New Roman" w:hAnsi="Times New Roman" w:cs="Times New Roman"/>
+          <w:sz w:val="20"/>
+          <w:szCs w:val="20"/>
+        </w:rPr>
+      </w:pPr>
+      <w:r>
+        <w:rPr>
+          <w:rFonts w:ascii="Times New Roman" w:hAnsi="Times New Roman" w:cs="Times New Roman"/>
+          <w:sz w:val="20"/>
+          <w:szCs w:val="20"/>
+        </w:rPr>
+        <w:t>4.7.8. На работы, запасные части и материалы по регламентному обслуживанию и уходу за агрегатом.</w:t>
+      </w:r>
+    </w:p>
+    <w:p>
+      <w:pPr>
+        <w:spacing w:after="0" w:line="240" w:lineRule="auto"/>
+        <w:jc w:val="both"/>
+        <w:rPr>
+          <w:rFonts w:ascii="Times New Roman" w:hAnsi="Times New Roman" w:cs="Times New Roman"/>
+          <w:sz w:val="20"/>
+          <w:szCs w:val="20"/>
         </w:rPr>
       </w:pPr>
     </w:p>
@@ -1232,224 +1915,18 @@
         <w:jc w:val="center"/>
         <w:rPr>
           <w:rFonts w:ascii="Times New Roman" w:hAnsi="Times New Roman" w:cs="Times New Roman"/>
-          <w:b/>
-          <w:color w:val="000000" w:themeColor="text1"/>
-          <w:sz w:val="20"/>
-          <w:szCs w:val="20"/>
-          <w:u w:val="single"/>
+          <w:sz w:val="20"/>
+          <w:szCs w:val="20"/>
         </w:rPr>
       </w:pPr>
-    </w:p>
-    <w:p>
-      <w:pPr>
-        <w:pStyle w:val="af3"/>
-        <w:rPr>
-          <w:rFonts w:ascii="Times New Roman" w:hAnsi="Times New Roman" w:cs="Times New Roman"/>
-          <w:b/>
-          <w:color w:val="000000" w:themeColor="text1"/>
-          <w:sz w:val="20"/>
-          <w:szCs w:val="20"/>
-          <w:u w:val="single"/>
-        </w:rPr>
-      </w:pPr>
-      <w:r>
-        <w:rPr>
-          <w:rFonts w:ascii="Times New Roman" w:hAnsi="Times New Roman" w:cs="Times New Roman"/>
-          <w:color w:val="000000" w:themeColor="text1"/>
-          <w:sz w:val="20"/>
-          <w:szCs w:val="20"/>
-        </w:rPr>
-        <w:t xml:space="preserve">3.1. Согласно </w:t>
-      </w:r>
-      <w:proofErr w:type="gramStart"/>
-      <w:r>
-        <w:rPr>
-          <w:rFonts w:ascii="Times New Roman" w:hAnsi="Times New Roman" w:cs="Times New Roman"/>
-          <w:color w:val="000000" w:themeColor="text1"/>
-          <w:sz w:val="20"/>
-          <w:szCs w:val="20"/>
-        </w:rPr>
-        <w:t>условиям  заключаемого</w:t>
-      </w:r>
-      <w:proofErr w:type="gramEnd"/>
-      <w:r>
-        <w:rPr>
-          <w:rFonts w:ascii="Times New Roman" w:hAnsi="Times New Roman" w:cs="Times New Roman"/>
-          <w:color w:val="000000" w:themeColor="text1"/>
-          <w:sz w:val="20"/>
-          <w:szCs w:val="20"/>
-        </w:rPr>
-        <w:t xml:space="preserve">   договора  стоимость  заявленного  двигателя  (номерного агрегата)  составляет </w:t>
-      </w:r>
-      <w:r>
-        <w:rPr>
-          <w:rFonts w:ascii="Times New Roman" w:hAnsi="Times New Roman" w:cs="Times New Roman"/>
-          <w:color w:val="000000" w:themeColor="text1"/>
-          <w:sz w:val="20"/>
-          <w:szCs w:val="20"/>
-        </w:rPr>
-        <w:t>{{</w:t>
-      </w:r>
-      <w:proofErr w:type="spellStart"/>
-      <w:r>
-        <w:rPr>
-          <w:rFonts w:ascii="Times New Roman" w:hAnsi="Times New Roman" w:cs="Times New Roman"/>
-          <w:color w:val="000000" w:themeColor="text1"/>
-          <w:sz w:val="20"/>
-          <w:szCs w:val="20"/>
-        </w:rPr>
-        <w:t>price</w:t>
-      </w:r>
-      <w:proofErr w:type="spellEnd"/>
-      <w:r>
-        <w:rPr>
-          <w:rFonts w:ascii="Times New Roman" w:hAnsi="Times New Roman" w:cs="Times New Roman"/>
-          <w:color w:val="000000" w:themeColor="text1"/>
-          <w:sz w:val="20"/>
-          <w:szCs w:val="20"/>
-        </w:rPr>
-        <w:t xml:space="preserve">}} </w:t>
-      </w:r>
-      <w:r>
-        <w:rPr>
-          <w:rFonts w:ascii="Times New Roman" w:hAnsi="Times New Roman" w:cs="Times New Roman"/>
-          <w:color w:val="000000" w:themeColor="text1"/>
-          <w:sz w:val="20"/>
-          <w:szCs w:val="20"/>
-        </w:rPr>
-        <w:t>(</w:t>
-      </w:r>
-      <w:r>
-        <w:rPr>
-          <w:rFonts w:ascii="Times New Roman" w:hAnsi="Times New Roman" w:cs="Times New Roman"/>
-          <w:color w:val="000000" w:themeColor="text1"/>
-          <w:sz w:val="20"/>
-          <w:szCs w:val="20"/>
-        </w:rPr>
-        <w:t>{{</w:t>
-      </w:r>
-      <w:proofErr w:type="spellStart"/>
-      <w:r>
-        <w:rPr>
-          <w:rFonts w:ascii="Times New Roman" w:hAnsi="Times New Roman" w:cs="Times New Roman"/>
-          <w:color w:val="000000" w:themeColor="text1"/>
-          <w:sz w:val="20"/>
-          <w:szCs w:val="20"/>
-        </w:rPr>
-        <w:t>price_words</w:t>
-      </w:r>
-      <w:proofErr w:type="spellEnd"/>
-      <w:r>
-        <w:rPr>
-          <w:rFonts w:ascii="Times New Roman" w:hAnsi="Times New Roman" w:cs="Times New Roman"/>
-          <w:color w:val="000000" w:themeColor="text1"/>
-          <w:sz w:val="20"/>
-          <w:szCs w:val="20"/>
-        </w:rPr>
-        <w:t>}}</w:t>
-      </w:r>
-      <w:r>
-        <w:rPr>
-          <w:rFonts w:ascii="Times New Roman" w:hAnsi="Times New Roman" w:cs="Times New Roman"/>
-          <w:color w:val="000000" w:themeColor="text1"/>
-          <w:sz w:val="20"/>
-          <w:szCs w:val="20"/>
-        </w:rPr>
-        <w:t>) рублей.</w:t>
-      </w:r>
-      <w:r>
-        <w:rPr>
-          <w:rFonts w:ascii="Times New Roman" w:hAnsi="Times New Roman" w:cs="Times New Roman"/>
-          <w:color w:val="000000" w:themeColor="text1"/>
-          <w:sz w:val="20"/>
-          <w:szCs w:val="20"/>
-        </w:rPr>
-        <w:br/>
-        <w:t xml:space="preserve">3.2. Покупатель оплачивает поставленный Продавцом Товар по </w:t>
-      </w:r>
-      <w:r>
-        <w:rPr>
-          <w:rFonts w:ascii="Times New Roman" w:hAnsi="Times New Roman" w:cs="Times New Roman"/>
-          <w:color w:val="000000" w:themeColor="text1"/>
-          <w:sz w:val="20"/>
-          <w:szCs w:val="20"/>
-        </w:rPr>
-        <w:t>цене</w:t>
-      </w:r>
-      <w:r>
-        <w:rPr>
-          <w:rFonts w:ascii="Times New Roman" w:hAnsi="Times New Roman" w:cs="Times New Roman"/>
-          <w:color w:val="000000" w:themeColor="text1"/>
-          <w:sz w:val="20"/>
-          <w:szCs w:val="20"/>
-        </w:rPr>
-        <w:t xml:space="preserve">, </w:t>
-      </w:r>
-      <w:r>
-        <w:rPr>
-          <w:rFonts w:ascii="Times New Roman" w:hAnsi="Times New Roman" w:cs="Times New Roman"/>
-          <w:color w:val="000000" w:themeColor="text1"/>
-          <w:sz w:val="20"/>
-          <w:szCs w:val="20"/>
-        </w:rPr>
-        <w:t xml:space="preserve">указанной </w:t>
-      </w:r>
-      <w:r>
-        <w:rPr>
-          <w:rFonts w:ascii="Times New Roman" w:hAnsi="Times New Roman" w:cs="Times New Roman"/>
-          <w:color w:val="000000" w:themeColor="text1"/>
-          <w:sz w:val="20"/>
-          <w:szCs w:val="20"/>
-        </w:rPr>
-        <w:t>в Спецификации, на данный Товар.</w:t>
-      </w:r>
-      <w:r>
-        <w:rPr>
-          <w:rFonts w:ascii="Times New Roman" w:hAnsi="Times New Roman" w:cs="Times New Roman"/>
-          <w:color w:val="000000" w:themeColor="text1"/>
-          <w:sz w:val="20"/>
-          <w:szCs w:val="20"/>
-        </w:rPr>
-        <w:br/>
-      </w:r>
-    </w:p>
-    <w:p>
-      <w:pPr>
-        <w:pStyle w:val="af3"/>
-        <w:jc w:val="center"/>
-        <w:rPr>
-          <w:rFonts w:ascii="Times New Roman" w:hAnsi="Times New Roman" w:cs="Times New Roman"/>
-          <w:color w:val="000000" w:themeColor="text1"/>
-          <w:sz w:val="20"/>
-          <w:szCs w:val="20"/>
-        </w:rPr>
-      </w:pPr>
-      <w:r>
-        <w:rPr>
-          <w:rFonts w:ascii="Times New Roman" w:hAnsi="Times New Roman" w:cs="Times New Roman"/>
-          <w:b/>
-          <w:color w:val="000000" w:themeColor="text1"/>
-          <w:sz w:val="20"/>
-          <w:szCs w:val="20"/>
-          <w:u w:val="single"/>
-        </w:rPr>
-        <w:lastRenderedPageBreak/>
-        <w:t>4. Гарантия</w:t>
-      </w:r>
-    </w:p>
-    <w:p>
-      <w:pPr>
-        <w:pStyle w:val="af3"/>
-        <w:jc w:val="center"/>
-        <w:rPr>
-          <w:rFonts w:ascii="Times New Roman" w:hAnsi="Times New Roman" w:cs="Times New Roman"/>
-          <w:b/>
-          <w:color w:val="000000" w:themeColor="text1"/>
-          <w:sz w:val="20"/>
-          <w:szCs w:val="20"/>
-          <w:u w:val="single"/>
-        </w:rPr>
-      </w:pPr>
+      <w:r>
+        <w:rPr>
+          <w:rFonts w:ascii="Times New Roman" w:hAnsi="Times New Roman" w:cs="Times New Roman"/>
+          <w:sz w:val="20"/>
+          <w:szCs w:val="20"/>
+        </w:rPr>
+        <w:t>5. ПРОЧИЕ УСЛОВИЯ</w:t>
+      </w:r>
     </w:p>
     <w:p>
       <w:pPr>
@@ -1457,7 +1934,6 @@
         <w:jc w:val="both"/>
         <w:rPr>
           <w:rFonts w:ascii="Times New Roman" w:hAnsi="Times New Roman" w:cs="Times New Roman"/>
-          <w:color w:val="000000" w:themeColor="text1"/>
           <w:sz w:val="20"/>
           <w:szCs w:val="20"/>
         </w:rPr>
@@ -1465,99 +1941,10 @@
       <w:r>
         <w:rPr>
           <w:rFonts w:ascii="Times New Roman" w:hAnsi="Times New Roman" w:cs="Times New Roman"/>
-          <w:color w:val="000000" w:themeColor="text1"/>
-          <w:sz w:val="20"/>
-          <w:szCs w:val="20"/>
-        </w:rPr>
-        <w:t xml:space="preserve">4.1. Гарантия предоставляется при условии правильной установки и эксплуатации агрегата. Регламентные работы по </w:t>
-      </w:r>
-      <w:r>
-        <w:rPr>
-          <w:rFonts w:ascii="Times New Roman" w:hAnsi="Times New Roman" w:cs="Times New Roman"/>
-          <w:color w:val="000000" w:themeColor="text1"/>
-          <w:sz w:val="20"/>
-          <w:szCs w:val="20"/>
-        </w:rPr>
-        <w:t>обслуживанию агрегата следует</w:t>
-      </w:r>
-      <w:r>
-        <w:rPr>
-          <w:rFonts w:ascii="Times New Roman" w:hAnsi="Times New Roman" w:cs="Times New Roman"/>
-          <w:color w:val="000000" w:themeColor="text1"/>
-          <w:sz w:val="20"/>
-          <w:szCs w:val="20"/>
-        </w:rPr>
-        <w:t xml:space="preserve">  производить в соответствии с требования указанными в сервисной книжке автомобиля, </w:t>
-      </w:r>
-    </w:p>
-    <w:p>
-      <w:pPr>
-        <w:spacing w:after="0" w:line="240" w:lineRule="auto"/>
-        <w:rPr>
-          <w:rFonts w:ascii="Times New Roman" w:hAnsi="Times New Roman" w:cs="Times New Roman"/>
-          <w:color w:val="000000" w:themeColor="text1"/>
-          <w:sz w:val="20"/>
-          <w:szCs w:val="20"/>
-        </w:rPr>
-      </w:pPr>
-      <w:r>
-        <w:rPr>
-          <w:rFonts w:ascii="Times New Roman" w:hAnsi="Times New Roman" w:cs="Times New Roman"/>
-          <w:color w:val="000000" w:themeColor="text1"/>
-          <w:sz w:val="20"/>
-          <w:szCs w:val="20"/>
-        </w:rPr>
-        <w:t>на который устанавливается агрегат в соответствии с пробегом.</w:t>
-      </w:r>
-      <w:r>
-        <w:rPr>
-          <w:rFonts w:ascii="Times New Roman" w:hAnsi="Times New Roman" w:cs="Times New Roman"/>
-          <w:color w:val="000000" w:themeColor="text1"/>
-          <w:sz w:val="20"/>
-          <w:szCs w:val="20"/>
-        </w:rPr>
-        <w:t xml:space="preserve"> </w:t>
-      </w:r>
-      <w:r>
-        <w:rPr>
-          <w:rFonts w:ascii="Times New Roman" w:hAnsi="Times New Roman" w:cs="Times New Roman"/>
-          <w:sz w:val="20"/>
-          <w:szCs w:val="20"/>
-        </w:rPr>
-        <w:t xml:space="preserve">Отсутствие отметок в сервисной книжке о прохождении </w:t>
-      </w:r>
-      <w:r>
-        <w:rPr>
-          <w:rFonts w:ascii="Times New Roman" w:hAnsi="Times New Roman" w:cs="Times New Roman"/>
-          <w:sz w:val="20"/>
-          <w:szCs w:val="20"/>
-        </w:rPr>
-        <w:t>обслуживания и проведения необходимых регламентных работ в соответствии с пробегом автомобиля считается нарушением правил эксплуатации агрегата</w:t>
-      </w:r>
-      <w:r>
-        <w:rPr>
-          <w:rFonts w:ascii="Times New Roman" w:hAnsi="Times New Roman" w:cs="Times New Roman"/>
-          <w:sz w:val="20"/>
-          <w:szCs w:val="20"/>
-        </w:rPr>
-        <w:t>.</w:t>
-      </w:r>
-      <w:r>
-        <w:rPr>
-          <w:rFonts w:ascii="Times New Roman" w:hAnsi="Times New Roman" w:cs="Times New Roman"/>
-          <w:sz w:val="20"/>
-          <w:szCs w:val="20"/>
-        </w:rPr>
-        <w:br/>
-      </w:r>
-      <w:r>
-        <w:rPr>
-          <w:rFonts w:ascii="Times New Roman" w:hAnsi="Times New Roman" w:cs="Times New Roman"/>
-          <w:color w:val="000000" w:themeColor="text1"/>
-          <w:sz w:val="20"/>
-          <w:szCs w:val="20"/>
-        </w:rPr>
-        <w:t>4.2. В целях предупреждения ухудшения качества работы узлов, выполнение работ по его установке следует проводить в условиях Автосервиса, имеющих ОКВЭД на осуществление данного вида деятельности.</w:t>
+          <w:sz w:val="20"/>
+          <w:szCs w:val="20"/>
+        </w:rPr>
+        <w:t>5.1. Все спорные вопросы решаются сторонами изначально путем переговоров. Обязателен досудебный претензионный порядок решения споров.</w:t>
       </w:r>
     </w:p>
     <w:p>
@@ -1566,7 +1953,6 @@
         <w:jc w:val="both"/>
         <w:rPr>
           <w:rFonts w:ascii="Times New Roman" w:hAnsi="Times New Roman" w:cs="Times New Roman"/>
-          <w:color w:val="000000" w:themeColor="text1"/>
           <w:sz w:val="20"/>
           <w:szCs w:val="20"/>
         </w:rPr>
@@ -1574,629 +1960,6 @@
       <w:r>
         <w:rPr>
           <w:rFonts w:ascii="Times New Roman" w:hAnsi="Times New Roman" w:cs="Times New Roman"/>
-          <w:color w:val="000000" w:themeColor="text1"/>
-          <w:sz w:val="20"/>
-          <w:szCs w:val="20"/>
-        </w:rPr>
-        <w:t xml:space="preserve">4.3. При соблюдении пункта 4.2. на приобретённые агрегаты устанавливается гарантийный срок на установку и проверку агрегата, сроком на </w:t>
-      </w:r>
-      <w:r>
-        <w:rPr>
-          <w:rFonts w:ascii="Times New Roman" w:hAnsi="Times New Roman" w:cs="Times New Roman"/>
-          <w:color w:val="000000" w:themeColor="text1"/>
-          <w:sz w:val="20"/>
-          <w:szCs w:val="20"/>
-        </w:rPr>
-        <w:t>{{</w:t>
-      </w:r>
-      <w:proofErr w:type="spellStart"/>
-      <w:r>
-        <w:rPr>
-          <w:rFonts w:ascii="Times New Roman" w:hAnsi="Times New Roman" w:cs="Times New Roman"/>
-          <w:color w:val="000000" w:themeColor="text1"/>
-          <w:sz w:val="20"/>
-          <w:szCs w:val="20"/>
-        </w:rPr>
-        <w:t>warranty_months</w:t>
-      </w:r>
-      <w:proofErr w:type="spellEnd"/>
-      <w:r>
-        <w:rPr>
-          <w:rFonts w:ascii="Times New Roman" w:hAnsi="Times New Roman" w:cs="Times New Roman"/>
-          <w:color w:val="000000" w:themeColor="text1"/>
-          <w:sz w:val="20"/>
-          <w:szCs w:val="20"/>
-        </w:rPr>
-        <w:t>}}</w:t>
-      </w:r>
-      <w:r>
-        <w:rPr>
-          <w:rFonts w:ascii="Times New Roman" w:hAnsi="Times New Roman" w:cs="Times New Roman"/>
-          <w:color w:val="000000" w:themeColor="text1"/>
-          <w:sz w:val="20"/>
-          <w:szCs w:val="20"/>
-        </w:rPr>
-        <w:t xml:space="preserve"> месяц</w:t>
-      </w:r>
-      <w:r>
-        <w:rPr>
-          <w:rFonts w:ascii="Times New Roman" w:hAnsi="Times New Roman" w:cs="Times New Roman"/>
-          <w:color w:val="000000" w:themeColor="text1"/>
-          <w:sz w:val="20"/>
-          <w:szCs w:val="20"/>
-        </w:rPr>
-        <w:t>а</w:t>
-      </w:r>
-      <w:r>
-        <w:rPr>
-          <w:rFonts w:ascii="Times New Roman" w:hAnsi="Times New Roman" w:cs="Times New Roman"/>
-          <w:color w:val="000000" w:themeColor="text1"/>
-          <w:sz w:val="20"/>
-          <w:szCs w:val="20"/>
-        </w:rPr>
-        <w:t xml:space="preserve"> </w:t>
-      </w:r>
-      <w:r>
-        <w:rPr>
-          <w:rFonts w:ascii="Times New Roman" w:hAnsi="Times New Roman" w:cs="Times New Roman"/>
-          <w:color w:val="000000" w:themeColor="text1"/>
-          <w:sz w:val="20"/>
-          <w:szCs w:val="20"/>
-        </w:rPr>
-        <w:t xml:space="preserve">или </w:t>
-      </w:r>
-      <w:r>
-        <w:rPr>
-          <w:rFonts w:ascii="Times New Roman" w:hAnsi="Times New Roman" w:cs="Times New Roman"/>
-          <w:color w:val="000000" w:themeColor="text1"/>
-          <w:sz w:val="20"/>
-          <w:szCs w:val="20"/>
-        </w:rPr>
-        <w:t>{{</w:t>
-      </w:r>
-      <w:proofErr w:type="spellStart"/>
-      <w:r>
-        <w:rPr>
-          <w:rFonts w:ascii="Times New Roman" w:hAnsi="Times New Roman" w:cs="Times New Roman"/>
-          <w:color w:val="000000" w:themeColor="text1"/>
-          <w:sz w:val="20"/>
-          <w:szCs w:val="20"/>
-        </w:rPr>
-        <w:t>warranty_km</w:t>
-      </w:r>
-      <w:proofErr w:type="spellEnd"/>
-      <w:r>
-        <w:rPr>
-          <w:rFonts w:ascii="Times New Roman" w:hAnsi="Times New Roman" w:cs="Times New Roman"/>
-          <w:color w:val="000000" w:themeColor="text1"/>
-          <w:sz w:val="20"/>
-          <w:szCs w:val="20"/>
-        </w:rPr>
-        <w:t>}}</w:t>
-      </w:r>
-      <w:r>
-        <w:rPr>
-          <w:rFonts w:ascii="Times New Roman" w:hAnsi="Times New Roman" w:cs="Times New Roman"/>
-          <w:color w:val="000000" w:themeColor="text1"/>
-          <w:sz w:val="20"/>
-          <w:szCs w:val="20"/>
-        </w:rPr>
-        <w:t xml:space="preserve"> к</w:t>
-      </w:r>
-      <w:r>
-        <w:rPr>
-          <w:rFonts w:ascii="Times New Roman" w:hAnsi="Times New Roman" w:cs="Times New Roman"/>
-          <w:color w:val="000000" w:themeColor="text1"/>
-          <w:sz w:val="20"/>
-          <w:szCs w:val="20"/>
-        </w:rPr>
-        <w:t>илометров</w:t>
-      </w:r>
-      <w:r>
-        <w:rPr>
-          <w:rFonts w:ascii="Times New Roman" w:hAnsi="Times New Roman" w:cs="Times New Roman"/>
-          <w:color w:val="000000" w:themeColor="text1"/>
-          <w:sz w:val="20"/>
-          <w:szCs w:val="20"/>
-        </w:rPr>
-        <w:t xml:space="preserve"> пробега (что наступит раньше), </w:t>
-      </w:r>
-      <w:r>
-        <w:rPr>
-          <w:rFonts w:ascii="Times New Roman" w:hAnsi="Times New Roman" w:cs="Times New Roman"/>
-          <w:color w:val="000000" w:themeColor="text1"/>
-          <w:sz w:val="20"/>
-          <w:szCs w:val="20"/>
-        </w:rPr>
-        <w:t xml:space="preserve">с момента получения агрегата. </w:t>
-      </w:r>
-    </w:p>
-    <w:p>
-      <w:pPr>
-        <w:spacing w:after="0" w:line="240" w:lineRule="auto"/>
-        <w:jc w:val="both"/>
-        <w:rPr>
-          <w:rFonts w:ascii="Times New Roman" w:hAnsi="Times New Roman" w:cs="Times New Roman"/>
-          <w:color w:val="000000" w:themeColor="text1"/>
-          <w:sz w:val="20"/>
-          <w:szCs w:val="20"/>
-        </w:rPr>
-      </w:pPr>
-      <w:r>
-        <w:rPr>
-          <w:rFonts w:ascii="Times New Roman" w:hAnsi="Times New Roman" w:cs="Times New Roman"/>
-          <w:color w:val="000000" w:themeColor="text1"/>
-          <w:sz w:val="20"/>
-          <w:szCs w:val="20"/>
-        </w:rPr>
-        <w:t xml:space="preserve">4.4. При установке агрегата вне условий </w:t>
-      </w:r>
-      <w:r>
-        <w:rPr>
-          <w:rFonts w:ascii="Times New Roman" w:hAnsi="Times New Roman" w:cs="Times New Roman"/>
-          <w:sz w:val="20"/>
-          <w:szCs w:val="20"/>
-        </w:rPr>
-        <w:t>сертифицированного</w:t>
-      </w:r>
-      <w:r>
-        <w:rPr>
-          <w:rFonts w:ascii="Times New Roman" w:hAnsi="Times New Roman" w:cs="Times New Roman"/>
-          <w:color w:val="000000" w:themeColor="text1"/>
-          <w:sz w:val="20"/>
-          <w:szCs w:val="20"/>
-        </w:rPr>
-        <w:t xml:space="preserve"> </w:t>
-      </w:r>
-      <w:r>
-        <w:rPr>
-          <w:rFonts w:ascii="Times New Roman" w:hAnsi="Times New Roman" w:cs="Times New Roman"/>
-          <w:color w:val="000000" w:themeColor="text1"/>
-          <w:sz w:val="20"/>
-          <w:szCs w:val="20"/>
-        </w:rPr>
-        <w:t>Автосервиса, Продавец снимает с себя гарантийные обязательства.</w:t>
-      </w:r>
-    </w:p>
-    <w:p>
-      <w:pPr>
-        <w:spacing w:after="0" w:line="240" w:lineRule="auto"/>
-        <w:jc w:val="both"/>
-        <w:rPr>
-          <w:rFonts w:ascii="Times New Roman" w:hAnsi="Times New Roman" w:cs="Times New Roman"/>
-          <w:color w:val="000000" w:themeColor="text1"/>
-          <w:sz w:val="20"/>
-          <w:szCs w:val="20"/>
-        </w:rPr>
-      </w:pPr>
-      <w:r>
-        <w:rPr>
-          <w:rFonts w:ascii="Times New Roman" w:hAnsi="Times New Roman" w:cs="Times New Roman"/>
-          <w:color w:val="000000" w:themeColor="text1"/>
-          <w:sz w:val="20"/>
-          <w:szCs w:val="20"/>
-        </w:rPr>
-        <w:t>4.5. Претензии принимаются в течение гарантийного срока, при условии соблюдения требований по установке и эксплуатации агрегата.</w:t>
-      </w:r>
-    </w:p>
-    <w:p>
-      <w:pPr>
-        <w:spacing w:after="0" w:line="240" w:lineRule="auto"/>
-        <w:jc w:val="both"/>
-        <w:rPr>
-          <w:rFonts w:ascii="Times New Roman" w:hAnsi="Times New Roman" w:cs="Times New Roman"/>
-          <w:sz w:val="20"/>
-          <w:szCs w:val="20"/>
-        </w:rPr>
-      </w:pPr>
-      <w:r>
-        <w:rPr>
-          <w:rFonts w:ascii="Times New Roman" w:hAnsi="Times New Roman" w:cs="Times New Roman"/>
-          <w:color w:val="000000" w:themeColor="text1"/>
-          <w:sz w:val="20"/>
-          <w:szCs w:val="20"/>
-        </w:rPr>
-        <w:t xml:space="preserve">4.6. При возникновении сомнений в качестве ДВС, покупатель должен произвести замер компрессии и проверку иных </w:t>
-      </w:r>
-      <w:r>
-        <w:rPr>
-          <w:rFonts w:ascii="Times New Roman" w:hAnsi="Times New Roman" w:cs="Times New Roman"/>
-          <w:sz w:val="20"/>
-          <w:szCs w:val="20"/>
-        </w:rPr>
-        <w:t xml:space="preserve">характеристик ДВС, вызывающих подозрения о неисправности.  </w:t>
-      </w:r>
-    </w:p>
-    <w:p>
-      <w:pPr>
-        <w:spacing w:after="0" w:line="240" w:lineRule="auto"/>
-        <w:jc w:val="both"/>
-        <w:rPr>
-          <w:rFonts w:ascii="Times New Roman" w:hAnsi="Times New Roman" w:cs="Times New Roman"/>
-          <w:sz w:val="20"/>
-          <w:szCs w:val="20"/>
-        </w:rPr>
-      </w:pPr>
-      <w:r>
-        <w:rPr>
-          <w:rFonts w:ascii="Times New Roman" w:hAnsi="Times New Roman" w:cs="Times New Roman"/>
-          <w:sz w:val="20"/>
-          <w:szCs w:val="20"/>
-        </w:rPr>
-        <w:t>4.6.1. При выявлении неисправных деталей, в приобретенном у Продавца агрегате, в течение гарантийного срока</w:t>
-      </w:r>
-      <w:r>
-        <w:rPr>
-          <w:rFonts w:ascii="Times New Roman" w:hAnsi="Times New Roman" w:cs="Times New Roman"/>
-          <w:sz w:val="20"/>
-          <w:szCs w:val="20"/>
-        </w:rPr>
-        <w:t>,</w:t>
-      </w:r>
-      <w:r>
-        <w:rPr>
-          <w:rFonts w:ascii="Times New Roman" w:hAnsi="Times New Roman" w:cs="Times New Roman"/>
-          <w:sz w:val="20"/>
-          <w:szCs w:val="20"/>
-        </w:rPr>
-        <w:t xml:space="preserve"> в результате диагностики на сертифицированном  Автосервисе, Продавец проводит замену неисправных комплектующих агрегата, либо компенсирует Покупателю их стоимость</w:t>
-      </w:r>
-      <w:r>
-        <w:rPr>
-          <w:rFonts w:ascii="Times New Roman" w:hAnsi="Times New Roman" w:cs="Times New Roman"/>
-          <w:sz w:val="20"/>
-          <w:szCs w:val="20"/>
-        </w:rPr>
-        <w:t xml:space="preserve"> в разумный срок</w:t>
-      </w:r>
-      <w:r>
-        <w:rPr>
-          <w:rFonts w:ascii="Times New Roman" w:hAnsi="Times New Roman" w:cs="Times New Roman"/>
-          <w:sz w:val="20"/>
-          <w:szCs w:val="20"/>
-        </w:rPr>
-        <w:t xml:space="preserve">. Услуги по диагностике неисправности, </w:t>
-      </w:r>
-      <w:r>
-        <w:rPr>
-          <w:rFonts w:ascii="Times New Roman" w:hAnsi="Times New Roman" w:cs="Times New Roman"/>
-          <w:sz w:val="20"/>
-          <w:szCs w:val="20"/>
-        </w:rPr>
-        <w:t xml:space="preserve">работ по </w:t>
-      </w:r>
-      <w:r>
-        <w:rPr>
-          <w:rFonts w:ascii="Times New Roman" w:hAnsi="Times New Roman" w:cs="Times New Roman"/>
-          <w:sz w:val="20"/>
-          <w:szCs w:val="20"/>
-        </w:rPr>
-        <w:t xml:space="preserve">замене неисправных комплектующих Покупатель оплачивает самостоятельно. Продавец компенсацию стоимости этих услуг не производит. </w:t>
-      </w:r>
-    </w:p>
-    <w:p>
-      <w:pPr>
-        <w:spacing w:after="0" w:line="240" w:lineRule="auto"/>
-        <w:jc w:val="both"/>
-        <w:rPr>
-          <w:rFonts w:ascii="Times New Roman" w:hAnsi="Times New Roman" w:cs="Times New Roman"/>
-          <w:sz w:val="20"/>
-          <w:szCs w:val="20"/>
-        </w:rPr>
-      </w:pPr>
-      <w:r>
-        <w:rPr>
-          <w:rFonts w:ascii="Times New Roman" w:hAnsi="Times New Roman" w:cs="Times New Roman"/>
-          <w:sz w:val="20"/>
-          <w:szCs w:val="20"/>
-        </w:rPr>
-        <w:t xml:space="preserve"> </w:t>
-      </w:r>
-      <w:r>
-        <w:rPr>
-          <w:rFonts w:ascii="Times New Roman" w:hAnsi="Times New Roman" w:cs="Times New Roman"/>
-          <w:sz w:val="20"/>
-          <w:szCs w:val="20"/>
-        </w:rPr>
-        <w:t>4.7. Гарантия не распространяется:</w:t>
-      </w:r>
-    </w:p>
-    <w:p>
-      <w:pPr>
-        <w:spacing w:after="0" w:line="240" w:lineRule="auto"/>
-        <w:jc w:val="both"/>
-        <w:rPr>
-          <w:rFonts w:ascii="Times New Roman" w:hAnsi="Times New Roman" w:cs="Times New Roman"/>
-          <w:sz w:val="20"/>
-          <w:szCs w:val="20"/>
-        </w:rPr>
-      </w:pPr>
-      <w:r>
-        <w:rPr>
-          <w:rFonts w:ascii="Times New Roman" w:hAnsi="Times New Roman" w:cs="Times New Roman"/>
-          <w:sz w:val="20"/>
-          <w:szCs w:val="20"/>
-        </w:rPr>
-        <w:t>4.7.</w:t>
-      </w:r>
-      <w:r>
-        <w:rPr>
-          <w:rFonts w:ascii="Times New Roman" w:hAnsi="Times New Roman" w:cs="Times New Roman"/>
-          <w:sz w:val="20"/>
-          <w:szCs w:val="20"/>
-        </w:rPr>
-        <w:t>1. Если</w:t>
-      </w:r>
-      <w:r>
-        <w:rPr>
-          <w:rFonts w:ascii="Times New Roman" w:hAnsi="Times New Roman" w:cs="Times New Roman"/>
-          <w:sz w:val="20"/>
-          <w:szCs w:val="20"/>
-        </w:rPr>
-        <w:t xml:space="preserve"> агрегат получил механические повреждения по вине Покупателя.</w:t>
-      </w:r>
-    </w:p>
-    <w:p>
-      <w:pPr>
-        <w:spacing w:after="0" w:line="240" w:lineRule="auto"/>
-        <w:jc w:val="both"/>
-        <w:rPr>
-          <w:rFonts w:ascii="Times New Roman" w:hAnsi="Times New Roman" w:cs="Times New Roman"/>
-          <w:sz w:val="20"/>
-          <w:szCs w:val="20"/>
-        </w:rPr>
-      </w:pPr>
-      <w:r>
-        <w:rPr>
-          <w:rFonts w:ascii="Times New Roman" w:hAnsi="Times New Roman" w:cs="Times New Roman"/>
-          <w:sz w:val="20"/>
-          <w:szCs w:val="20"/>
-        </w:rPr>
-        <w:t>4.7.2. Если продавец несвоевременно извещён о наличии дефектов.</w:t>
-      </w:r>
-    </w:p>
-    <w:p>
-      <w:pPr>
-        <w:spacing w:after="0" w:line="240" w:lineRule="auto"/>
-        <w:jc w:val="both"/>
-        <w:rPr>
-          <w:rFonts w:ascii="Times New Roman" w:hAnsi="Times New Roman" w:cs="Times New Roman"/>
-          <w:color w:val="000000" w:themeColor="text1"/>
-          <w:sz w:val="20"/>
-          <w:szCs w:val="20"/>
-        </w:rPr>
-      </w:pPr>
-      <w:r>
-        <w:rPr>
-          <w:rFonts w:ascii="Times New Roman" w:hAnsi="Times New Roman" w:cs="Times New Roman"/>
-          <w:color w:val="000000" w:themeColor="text1"/>
-          <w:sz w:val="20"/>
-          <w:szCs w:val="20"/>
-        </w:rPr>
-        <w:t>4.7.3.</w:t>
-      </w:r>
-      <w:r>
-        <w:rPr>
-          <w:rFonts w:ascii="Times New Roman" w:hAnsi="Times New Roman" w:cs="Times New Roman"/>
-          <w:color w:val="000000" w:themeColor="text1"/>
-          <w:sz w:val="20"/>
-          <w:szCs w:val="20"/>
-        </w:rPr>
-        <w:t xml:space="preserve"> </w:t>
-      </w:r>
-      <w:r>
-        <w:rPr>
-          <w:rFonts w:ascii="Times New Roman" w:hAnsi="Times New Roman" w:cs="Times New Roman"/>
-          <w:color w:val="000000" w:themeColor="text1"/>
-          <w:sz w:val="20"/>
-          <w:szCs w:val="20"/>
-        </w:rPr>
-        <w:t xml:space="preserve">Если ДВС эксплуатируется на автомобиле с неисправной системой охлаждения двигателя,  или с несоответствующим данному двигателю маслом, или с уровнем масла ниже критической отметки. </w:t>
-      </w:r>
-    </w:p>
-    <w:p>
-      <w:pPr>
-        <w:spacing w:after="0" w:line="240" w:lineRule="auto"/>
-        <w:jc w:val="both"/>
-        <w:rPr>
-          <w:rFonts w:ascii="Times New Roman" w:hAnsi="Times New Roman" w:cs="Times New Roman"/>
-          <w:color w:val="000000" w:themeColor="text1"/>
-          <w:sz w:val="20"/>
-          <w:szCs w:val="20"/>
-        </w:rPr>
-      </w:pPr>
-      <w:r>
-        <w:rPr>
-          <w:rFonts w:ascii="Times New Roman" w:hAnsi="Times New Roman" w:cs="Times New Roman"/>
-          <w:color w:val="000000" w:themeColor="text1"/>
-          <w:sz w:val="20"/>
-          <w:szCs w:val="20"/>
-        </w:rPr>
-        <w:t>4.7.4. На сальники, маслосъёмные колпачки, прокладки поддона и клапанные крышки.</w:t>
-      </w:r>
-    </w:p>
-    <w:p>
-      <w:pPr>
-        <w:spacing w:after="0" w:line="240" w:lineRule="auto"/>
-        <w:jc w:val="both"/>
-        <w:rPr>
-          <w:rFonts w:ascii="Times New Roman" w:hAnsi="Times New Roman" w:cs="Times New Roman"/>
-          <w:color w:val="000000" w:themeColor="text1"/>
-          <w:sz w:val="20"/>
-          <w:szCs w:val="20"/>
-        </w:rPr>
-      </w:pPr>
-      <w:r>
-        <w:rPr>
-          <w:rFonts w:ascii="Times New Roman" w:hAnsi="Times New Roman" w:cs="Times New Roman"/>
-          <w:color w:val="000000" w:themeColor="text1"/>
-          <w:sz w:val="20"/>
-          <w:szCs w:val="20"/>
-        </w:rPr>
-        <w:t xml:space="preserve">4.7.5. В случае, если агрегат был разобран без согласования с Продавцом и нарушены метки. </w:t>
-      </w:r>
-    </w:p>
-    <w:p>
-      <w:pPr>
-        <w:spacing w:after="0" w:line="240" w:lineRule="auto"/>
-        <w:jc w:val="both"/>
-        <w:rPr>
-          <w:rFonts w:ascii="Times New Roman" w:hAnsi="Times New Roman" w:cs="Times New Roman"/>
-          <w:color w:val="000000" w:themeColor="text1"/>
-          <w:sz w:val="20"/>
-          <w:szCs w:val="20"/>
-        </w:rPr>
-      </w:pPr>
-      <w:r>
-        <w:rPr>
-          <w:rFonts w:ascii="Times New Roman" w:hAnsi="Times New Roman" w:cs="Times New Roman"/>
-          <w:color w:val="000000" w:themeColor="text1"/>
-          <w:sz w:val="20"/>
-          <w:szCs w:val="20"/>
-        </w:rPr>
-        <w:t>4.7.6. Если агрегат приобретён для установки на автомобиль, на который узел не устанавливался серийно, либо при изменении объёма двигателя или топлива. Ответственность за его конструктивную совместимость и эксплуатационные характеристики Покупатель берёт на себя.</w:t>
-      </w:r>
-    </w:p>
-    <w:p>
-      <w:pPr>
-        <w:spacing w:after="0" w:line="240" w:lineRule="auto"/>
-        <w:jc w:val="both"/>
-        <w:rPr>
-          <w:rFonts w:ascii="Times New Roman" w:hAnsi="Times New Roman" w:cs="Times New Roman"/>
-          <w:sz w:val="20"/>
-          <w:szCs w:val="20"/>
-        </w:rPr>
-      </w:pPr>
-      <w:r>
-        <w:rPr>
-          <w:rFonts w:ascii="Times New Roman" w:hAnsi="Times New Roman" w:cs="Times New Roman"/>
-          <w:sz w:val="20"/>
-          <w:szCs w:val="20"/>
-        </w:rPr>
-        <w:t xml:space="preserve">4.7.7. В случае если </w:t>
-      </w:r>
-      <w:r>
-        <w:rPr>
-          <w:rFonts w:ascii="Times New Roman" w:hAnsi="Times New Roman" w:cs="Times New Roman"/>
-          <w:sz w:val="20"/>
-          <w:szCs w:val="20"/>
-        </w:rPr>
-        <w:t>агрегат (</w:t>
-      </w:r>
-      <w:r>
-        <w:rPr>
-          <w:rFonts w:ascii="Times New Roman" w:hAnsi="Times New Roman" w:cs="Times New Roman"/>
-          <w:sz w:val="20"/>
-          <w:szCs w:val="20"/>
-        </w:rPr>
-        <w:t>двигатель</w:t>
-      </w:r>
-      <w:r>
-        <w:rPr>
-          <w:rFonts w:ascii="Times New Roman" w:hAnsi="Times New Roman" w:cs="Times New Roman"/>
-          <w:sz w:val="20"/>
-          <w:szCs w:val="20"/>
-        </w:rPr>
-        <w:t>)</w:t>
-      </w:r>
-      <w:r>
-        <w:rPr>
-          <w:rFonts w:ascii="Times New Roman" w:hAnsi="Times New Roman" w:cs="Times New Roman"/>
-          <w:sz w:val="20"/>
-          <w:szCs w:val="20"/>
-        </w:rPr>
-        <w:t xml:space="preserve"> </w:t>
-      </w:r>
-      <w:r>
-        <w:rPr>
-          <w:rFonts w:ascii="Times New Roman" w:hAnsi="Times New Roman" w:cs="Times New Roman"/>
-          <w:sz w:val="20"/>
-          <w:szCs w:val="20"/>
-        </w:rPr>
-        <w:t xml:space="preserve">на автомобиле работал на газомоторном топливе, либо бензине иной марки, чем рекомендовано производителем. </w:t>
-      </w:r>
-    </w:p>
-    <w:p>
-      <w:pPr>
-        <w:spacing w:after="0" w:line="240" w:lineRule="auto"/>
-        <w:jc w:val="both"/>
-        <w:rPr>
-          <w:rFonts w:ascii="Times New Roman" w:hAnsi="Times New Roman" w:cs="Times New Roman"/>
-          <w:sz w:val="20"/>
-          <w:szCs w:val="20"/>
-        </w:rPr>
-      </w:pPr>
-      <w:r>
-        <w:rPr>
-          <w:rFonts w:ascii="Times New Roman" w:hAnsi="Times New Roman" w:cs="Times New Roman"/>
-          <w:sz w:val="20"/>
-          <w:szCs w:val="20"/>
-        </w:rPr>
-        <w:t>4.7.8. На работы, запасные части и материалы по регламентному обслуживанию и уходу за агрегатом.</w:t>
-      </w:r>
-    </w:p>
-    <w:p>
-      <w:pPr>
-        <w:spacing w:after="0" w:line="240" w:lineRule="auto"/>
-        <w:jc w:val="both"/>
-        <w:rPr>
-          <w:rFonts w:ascii="Times New Roman" w:hAnsi="Times New Roman" w:cs="Times New Roman"/>
-          <w:sz w:val="20"/>
-          <w:szCs w:val="20"/>
-        </w:rPr>
-      </w:pPr>
-    </w:p>
-    <w:p>
-      <w:pPr>
-        <w:spacing w:after="0" w:line="240" w:lineRule="auto"/>
-        <w:jc w:val="center"/>
-        <w:rPr>
-          <w:rFonts w:ascii="Times New Roman" w:hAnsi="Times New Roman" w:cs="Times New Roman"/>
-          <w:sz w:val="20"/>
-          <w:szCs w:val="20"/>
-        </w:rPr>
-      </w:pPr>
-      <w:r>
-        <w:rPr>
-          <w:rFonts w:ascii="Times New Roman" w:hAnsi="Times New Roman" w:cs="Times New Roman"/>
-          <w:sz w:val="20"/>
-          <w:szCs w:val="20"/>
-        </w:rPr>
-        <w:t>5. ПРОЧИЕ УСЛОВИЯ</w:t>
-      </w:r>
-    </w:p>
-    <w:p>
-      <w:pPr>
-        <w:spacing w:after="0" w:line="240" w:lineRule="auto"/>
-        <w:jc w:val="both"/>
-        <w:rPr>
-          <w:rFonts w:ascii="Times New Roman" w:hAnsi="Times New Roman" w:cs="Times New Roman"/>
-          <w:sz w:val="20"/>
-          <w:szCs w:val="20"/>
-        </w:rPr>
-      </w:pPr>
-      <w:r>
-        <w:rPr>
-          <w:rFonts w:ascii="Times New Roman" w:hAnsi="Times New Roman" w:cs="Times New Roman"/>
-          <w:sz w:val="20"/>
-          <w:szCs w:val="20"/>
-        </w:rPr>
-        <w:t>5.1. Все спорные вопросы решаются сторонами изначально путем переговоров. Обязателен досудебный претензионный порядок решения споров.</w:t>
-      </w:r>
-    </w:p>
-    <w:p>
-      <w:pPr>
-        <w:spacing w:after="0" w:line="240" w:lineRule="auto"/>
-        <w:jc w:val="both"/>
-        <w:rPr>
-          <w:rFonts w:ascii="Times New Roman" w:hAnsi="Times New Roman" w:cs="Times New Roman"/>
-          <w:sz w:val="20"/>
-          <w:szCs w:val="20"/>
-        </w:rPr>
-      </w:pPr>
-      <w:r>
-        <w:rPr>
-          <w:rFonts w:ascii="Times New Roman" w:hAnsi="Times New Roman" w:cs="Times New Roman"/>
           <w:sz w:val="20"/>
           <w:szCs w:val="20"/>
         </w:rPr>
@@ -2208,25 +1971,7 @@
           <w:sz w:val="20"/>
           <w:szCs w:val="20"/>
         </w:rPr>
-        <w:t xml:space="preserve">для решения споров в судебном порядке. Судом, рассматривающим </w:t>
-      </w:r>
-      <w:proofErr w:type="gramStart"/>
-      <w:r>
-        <w:rPr>
-          <w:rFonts w:ascii="Times New Roman" w:hAnsi="Times New Roman" w:cs="Times New Roman"/>
-          <w:sz w:val="20"/>
-          <w:szCs w:val="20"/>
-        </w:rPr>
-        <w:t>дело</w:t>
-      </w:r>
-      <w:proofErr w:type="gramEnd"/>
-      <w:r>
-        <w:rPr>
-          <w:rFonts w:ascii="Times New Roman" w:hAnsi="Times New Roman" w:cs="Times New Roman"/>
-          <w:sz w:val="20"/>
-          <w:szCs w:val="20"/>
-        </w:rPr>
-        <w:t xml:space="preserve"> вытекающее из настоящего договора, будет являться Орджоникидзевский районный суд города Екатеринбурга (подсудность по месту нахождения продавца).</w:t>
+        <w:t>для решения споров в судебном порядке. Судом, рассматривающим дело вытекающее из настоящего договора, будет являться Орджоникидзевский районный суд города Екатеринбурга (подсудность по месту нахождения продавца).</w:t>
       </w:r>
     </w:p>
     <w:p>
@@ -2449,14 +2194,12 @@
                 <w:color w:val="000000" w:themeColor="text1"/>
               </w:rPr>
             </w:pPr>
-            <w:proofErr w:type="gramStart"/>
             <w:r>
               <w:rPr>
                 <w:color w:val="000000" w:themeColor="text1"/>
               </w:rPr>
               <w:t>ОГРН  304667004400114</w:t>
             </w:r>
-            <w:proofErr w:type="gramEnd"/>
           </w:p>
           <w:p>
             <w:pPr>
@@ -2533,27 +2276,11 @@
                 <w:color w:val="000000" w:themeColor="text1"/>
               </w:rPr>
             </w:pPr>
-            <w:proofErr w:type="spellStart"/>
-            <w:proofErr w:type="gramStart"/>
             <w:r>
               <w:rPr>
                 <w:color w:val="000000" w:themeColor="text1"/>
               </w:rPr>
-              <w:t>обл</w:t>
-            </w:r>
-            <w:proofErr w:type="spellEnd"/>
-            <w:r>
-              <w:rPr>
-                <w:color w:val="000000" w:themeColor="text1"/>
-              </w:rPr>
-              <w:t>,  город</w:t>
-            </w:r>
-            <w:proofErr w:type="gramEnd"/>
-            <w:r>
-              <w:rPr>
-                <w:color w:val="000000" w:themeColor="text1"/>
-              </w:rPr>
-              <w:t xml:space="preserve"> Екатеринбург, ул. Бабушкина, д. 45</w:t>
+              <w:t>обл,  город Екатеринбург, ул. Бабушкина, д. 45</w:t>
             </w:r>
           </w:p>
           <w:p>
@@ -2575,27 +2302,11 @@
                 <w:color w:val="000000" w:themeColor="text1"/>
               </w:rPr>
             </w:pPr>
-            <w:proofErr w:type="spellStart"/>
-            <w:proofErr w:type="gramStart"/>
             <w:r>
               <w:rPr>
                 <w:color w:val="000000" w:themeColor="text1"/>
               </w:rPr>
-              <w:t>обл</w:t>
-            </w:r>
-            <w:proofErr w:type="spellEnd"/>
-            <w:r>
-              <w:rPr>
-                <w:color w:val="000000" w:themeColor="text1"/>
-              </w:rPr>
-              <w:t>,  город</w:t>
-            </w:r>
-            <w:proofErr w:type="gramEnd"/>
-            <w:r>
-              <w:rPr>
-                <w:color w:val="000000" w:themeColor="text1"/>
-              </w:rPr>
-              <w:t xml:space="preserve"> Екатеринбург, ул. Фронтовых Бригад, д. 18</w:t>
+              <w:t>обл,  город Екатеринбург, ул. Фронтовых Бригад, д. 18</w:t>
             </w:r>
             <w:r>
               <w:rPr>
@@ -2787,16 +2498,129 @@
               <w:rPr>
                 <w:color w:val="000000" w:themeColor="text1"/>
               </w:rPr>
+              <w:t>{{fio}}</w:t>
+            </w:r>
+          </w:p>
+          <w:p>
+            <w:pPr>
+              <w:rPr>
+                <w:color w:val="000000" w:themeColor="text1"/>
+              </w:rPr>
+            </w:pPr>
+            <w:r>
+              <w:rPr>
+                <w:color w:val="000000" w:themeColor="text1"/>
+              </w:rPr>
+              <w:t>Паспорт</w:t>
+            </w:r>
+            <w:r>
+              <w:rPr>
+                <w:color w:val="000000" w:themeColor="text1"/>
+              </w:rPr>
+              <w:t xml:space="preserve">: </w:t>
+            </w:r>
+            <w:r>
+              <w:rPr>
+                <w:color w:val="000000" w:themeColor="text1"/>
+              </w:rPr>
               <w:t>{{</w:t>
             </w:r>
-            <w:proofErr w:type="spellStart"/>
             <w:r>
               <w:rPr>
                 <w:color w:val="000000" w:themeColor="text1"/>
-              </w:rPr>
-              <w:t>fio</w:t>
+                <w:lang w:val="en-US"/>
+              </w:rPr>
+              <w:t>passport</w:t>
             </w:r>
-            <w:proofErr w:type="spellEnd"/>
+            <w:r>
+              <w:rPr>
+                <w:color w:val="000000" w:themeColor="text1"/>
+              </w:rPr>
+              <w:t>_</w:t>
+            </w:r>
+            <w:r>
+              <w:rPr>
+                <w:color w:val="000000" w:themeColor="text1"/>
+                <w:lang w:val="en-US"/>
+              </w:rPr>
+              <w:t>series</w:t>
+            </w:r>
+            <w:r>
+              <w:rPr>
+                <w:color w:val="000000" w:themeColor="text1"/>
+              </w:rPr>
+              <w:t>}} {{</w:t>
+            </w:r>
+            <w:r>
+              <w:rPr>
+                <w:color w:val="000000" w:themeColor="text1"/>
+                <w:lang w:val="en-US"/>
+              </w:rPr>
+              <w:t>passport</w:t>
+            </w:r>
+            <w:r>
+              <w:rPr>
+                <w:color w:val="000000" w:themeColor="text1"/>
+              </w:rPr>
+              <w:t>_</w:t>
+            </w:r>
+            <w:r>
+              <w:rPr>
+                <w:color w:val="000000" w:themeColor="text1"/>
+                <w:lang w:val="en-US"/>
+              </w:rPr>
+              <w:t>num</w:t>
+            </w:r>
+            <w:r>
+              <w:rPr>
+                <w:color w:val="000000" w:themeColor="text1"/>
+              </w:rPr>
+              <w:t>}}</w:t>
+            </w:r>
+            <w:r>
+              <w:rPr>
+                <w:color w:val="000000" w:themeColor="text1"/>
+              </w:rPr>
+              <w:br/>
+            </w:r>
+            <w:r>
+              <w:rPr>
+                <w:color w:val="000000" w:themeColor="text1"/>
+              </w:rPr>
+              <w:t>Выдан</w:t>
+            </w:r>
+            <w:r>
+              <w:rPr>
+                <w:color w:val="000000" w:themeColor="text1"/>
+              </w:rPr>
+              <w:t xml:space="preserve">: </w:t>
+            </w:r>
+            <w:r>
+              <w:rPr>
+                <w:color w:val="000000" w:themeColor="text1"/>
+              </w:rPr>
+              <w:t>{{</w:t>
+            </w:r>
+            <w:r>
+              <w:rPr>
+                <w:color w:val="000000" w:themeColor="text1"/>
+                <w:lang w:val="en-US"/>
+              </w:rPr>
+              <w:t>passport</w:t>
+            </w:r>
+            <w:r>
+              <w:rPr>
+                <w:color w:val="000000" w:themeColor="text1"/>
+              </w:rPr>
+              <w:t>_</w:t>
+            </w:r>
+            <w:r>
+              <w:rPr>
+                <w:color w:val="000000" w:themeColor="text1"/>
+                <w:lang w:val="en-US"/>
+              </w:rPr>
+              <w:t>issued</w:t>
+            </w:r>
             <w:r>
               <w:rPr>
                 <w:color w:val="000000" w:themeColor="text1"/>
@@ -2814,7 +2638,19 @@
               <w:rPr>
                 <w:color w:val="000000" w:themeColor="text1"/>
               </w:rPr>
-              <w:t>Паспорт</w:t>
+              <w:t>Код</w:t>
+            </w:r>
+            <w:r>
+              <w:rPr>
+                <w:color w:val="000000" w:themeColor="text1"/>
+              </w:rPr>
+              <w:t xml:space="preserve"> </w:t>
+            </w:r>
+            <w:r>
+              <w:rPr>
+                <w:color w:val="000000" w:themeColor="text1"/>
+              </w:rPr>
+              <w:t>подразделения</w:t>
             </w:r>
             <w:r>
               <w:rPr>
@@ -2846,83 +2682,7 @@
                 <w:color w:val="000000" w:themeColor="text1"/>
                 <w:lang w:val="en-US"/>
               </w:rPr>
-              <w:t>series</w:t>
-            </w:r>
-            <w:r>
-              <w:rPr>
-                <w:color w:val="000000" w:themeColor="text1"/>
-              </w:rPr>
-              <w:t>}} {{</w:t>
-            </w:r>
-            <w:r>
-              <w:rPr>
-                <w:color w:val="000000" w:themeColor="text1"/>
-                <w:lang w:val="en-US"/>
-              </w:rPr>
-              <w:t>passport</w:t>
-            </w:r>
-            <w:r>
-              <w:rPr>
-                <w:color w:val="000000" w:themeColor="text1"/>
-              </w:rPr>
-              <w:t>_</w:t>
-            </w:r>
-            <w:r>
-              <w:rPr>
-                <w:color w:val="000000" w:themeColor="text1"/>
-                <w:lang w:val="en-US"/>
-              </w:rPr>
-              <w:t>num</w:t>
-            </w:r>
-            <w:r>
-              <w:rPr>
-                <w:color w:val="000000" w:themeColor="text1"/>
-              </w:rPr>
-              <w:t>}}</w:t>
-            </w:r>
-            <w:r>
-              <w:rPr>
-                <w:color w:val="000000" w:themeColor="text1"/>
-              </w:rPr>
-              <w:br/>
-            </w:r>
-            <w:r>
-              <w:rPr>
-                <w:color w:val="000000" w:themeColor="text1"/>
-              </w:rPr>
-              <w:t>Выдан</w:t>
-            </w:r>
-            <w:r>
-              <w:rPr>
-                <w:color w:val="000000" w:themeColor="text1"/>
-              </w:rPr>
-              <w:t xml:space="preserve">: </w:t>
-            </w:r>
-            <w:r>
-              <w:rPr>
-                <w:color w:val="000000" w:themeColor="text1"/>
-              </w:rPr>
-              <w:t>{{</w:t>
-            </w:r>
-            <w:r>
-              <w:rPr>
-                <w:color w:val="000000" w:themeColor="text1"/>
-                <w:lang w:val="en-US"/>
-              </w:rPr>
-              <w:t>passport</w:t>
-            </w:r>
-            <w:r>
-              <w:rPr>
-                <w:color w:val="000000" w:themeColor="text1"/>
-              </w:rPr>
-              <w:t>_</w:t>
-            </w:r>
-            <w:r>
-              <w:rPr>
-                <w:color w:val="000000" w:themeColor="text1"/>
-                <w:lang w:val="en-US"/>
-              </w:rPr>
-              <w:t>issued</w:t>
+              <w:t>code</w:t>
             </w:r>
             <w:r>
               <w:rPr>
@@ -2934,62 +2694,37 @@
           <w:p>
             <w:pPr>
               <w:rPr>
-                <w:color w:val="000000" w:themeColor="text1"/>
+                <w:color w:val="000000"/>
               </w:rPr>
             </w:pPr>
             <w:r>
               <w:rPr>
-                <w:color w:val="000000" w:themeColor="text1"/>
-              </w:rPr>
-              <w:t>Код</w:t>
+                <w:color w:val="000000"/>
+              </w:rPr>
+              <w:t>Адрес</w:t>
             </w:r>
             <w:r>
               <w:rPr>
-                <w:color w:val="000000" w:themeColor="text1"/>
-              </w:rPr>
-              <w:t xml:space="preserve"> </w:t>
+                <w:color w:val="000000"/>
+              </w:rPr>
+              <w:t xml:space="preserve">:  </w:t>
             </w:r>
             <w:r>
               <w:rPr>
-                <w:color w:val="000000" w:themeColor="text1"/>
-              </w:rPr>
-              <w:t>подразделения</w:t>
-            </w:r>
-            <w:r>
-              <w:rPr>
-                <w:color w:val="000000" w:themeColor="text1"/>
-              </w:rPr>
-              <w:t xml:space="preserve">: </w:t>
-            </w:r>
-            <w:r>
-              <w:rPr>
-                <w:color w:val="000000" w:themeColor="text1"/>
+                <w:color w:val="000000"/>
               </w:rPr>
               <w:t>{{</w:t>
             </w:r>
             <w:r>
               <w:rPr>
-                <w:color w:val="000000" w:themeColor="text1"/>
+                <w:color w:val="000000"/>
                 <w:lang w:val="en-US"/>
               </w:rPr>
-              <w:t>passport</w:t>
+              <w:t>address</w:t>
             </w:r>
             <w:r>
               <w:rPr>
-                <w:color w:val="000000" w:themeColor="text1"/>
-              </w:rPr>
-              <w:t>_</w:t>
-            </w:r>
-            <w:r>
-              <w:rPr>
-                <w:color w:val="000000" w:themeColor="text1"/>
-                <w:lang w:val="en-US"/>
-              </w:rPr>
-              <w:t>code</w:t>
-            </w:r>
-            <w:r>
-              <w:rPr>
-                <w:color w:val="000000" w:themeColor="text1"/>
+                <w:color w:val="000000"/>
               </w:rPr>
               <w:t>}}</w:t>
             </w:r>
@@ -2997,52 +2732,6 @@
           <w:p>
             <w:pPr>
               <w:rPr>
-                <w:color w:val="000000"/>
-              </w:rPr>
-            </w:pPr>
-            <w:proofErr w:type="gramStart"/>
-            <w:r>
-              <w:rPr>
-                <w:color w:val="000000"/>
-              </w:rPr>
-              <w:t>Адрес</w:t>
-            </w:r>
-            <w:r>
-              <w:rPr>
-                <w:color w:val="000000"/>
-              </w:rPr>
-              <w:t xml:space="preserve">:  </w:t>
-            </w:r>
-            <w:r>
-              <w:rPr>
-                <w:color w:val="000000"/>
-              </w:rPr>
-              <w:t>{</w:t>
-            </w:r>
-            <w:proofErr w:type="gramEnd"/>
-            <w:r>
-              <w:rPr>
-                <w:color w:val="000000"/>
-              </w:rPr>
-              <w:t>{</w:t>
-            </w:r>
-            <w:r>
-              <w:rPr>
-                <w:color w:val="000000"/>
-                <w:lang w:val="en-US"/>
-              </w:rPr>
-              <w:t>address</w:t>
-            </w:r>
-            <w:r>
-              <w:rPr>
-                <w:color w:val="000000"/>
-              </w:rPr>
-              <w:t>}}</w:t>
-            </w:r>
-          </w:p>
-          <w:p>
-            <w:pPr>
-              <w:rPr>
                 <w:color w:val="000000" w:themeColor="text1"/>
               </w:rPr>
             </w:pPr>
@@ -3050,21 +2739,7 @@
               <w:rPr>
                 <w:color w:val="000000" w:themeColor="text1"/>
               </w:rPr>
-              <w:t>ИНН: {{</w:t>
-            </w:r>
-            <w:proofErr w:type="spellStart"/>
-            <w:r>
-              <w:rPr>
-                <w:color w:val="000000" w:themeColor="text1"/>
-              </w:rPr>
-              <w:t>inn</w:t>
-            </w:r>
-            <w:proofErr w:type="spellEnd"/>
-            <w:r>
-              <w:rPr>
-                <w:color w:val="000000" w:themeColor="text1"/>
-              </w:rPr>
-              <w:t>}}</w:t>
+              <w:t>ИНН: {{inn}}</w:t>
             </w:r>
           </w:p>
           <w:p>
@@ -3090,7 +2765,6 @@
             <w:pPr>
               <w:rPr>
                 <w:color w:val="000000" w:themeColor="text1"/>
-                <w:lang w:val="en-US"/>
               </w:rPr>
             </w:pPr>
             <w:r>
@@ -3103,7 +2777,6 @@
             <w:r>
               <w:rPr>
                 <w:color w:val="000000" w:themeColor="text1"/>
-                <w:lang w:val="en-US"/>
               </w:rPr>
               <w:t>-</w:t>
             </w:r>
@@ -3117,7 +2790,6 @@
             <w:r>
               <w:rPr>
                 <w:color w:val="000000" w:themeColor="text1"/>
-                <w:lang w:val="en-US"/>
               </w:rPr>
               <w:t>: ____________________</w:t>
             </w:r>
@@ -3126,7 +2798,6 @@
             <w:pPr>
               <w:rPr>
                 <w:color w:val="000000" w:themeColor="text1"/>
-                <w:lang w:val="en-US"/>
               </w:rPr>
             </w:pPr>
           </w:p>
@@ -3134,7 +2805,6 @@
             <w:pPr>
               <w:rPr>
                 <w:color w:val="000000" w:themeColor="text1"/>
-                <w:lang w:val="en-US"/>
               </w:rPr>
             </w:pPr>
           </w:p>
@@ -3142,7 +2812,6 @@
             <w:pPr>
               <w:rPr>
                 <w:color w:val="000000" w:themeColor="text1"/>
-                <w:lang w:val="en-US"/>
               </w:rPr>
             </w:pPr>
           </w:p>
@@ -3150,7 +2819,6 @@
             <w:pPr>
               <w:rPr>
                 <w:color w:val="000000" w:themeColor="text1"/>
-                <w:lang w:val="en-US"/>
               </w:rPr>
             </w:pPr>
           </w:p>
@@ -3164,9 +2832,15 @@
             <w:r>
               <w:rPr>
                 <w:color w:val="000000" w:themeColor="text1"/>
+              </w:rPr>
+              <w:t xml:space="preserve">                                       </w:t>
+            </w:r>
+            <w:r>
+              <w:rPr>
+                <w:color w:val="000000" w:themeColor="text1"/>
                 <w:lang w:val="en-US"/>
               </w:rPr>
-              <w:t xml:space="preserve">                                       _______________/______________</w:t>
+              <w:t>_______________/______________</w:t>
             </w:r>
           </w:p>
           <w:bookmarkEnd w:id="2"/>
@@ -3293,31 +2967,7 @@
           <w:sz w:val="20"/>
           <w:szCs w:val="20"/>
         </w:rPr>
-        <w:t>{{</w:t>
-      </w:r>
-      <w:proofErr w:type="spellStart"/>
-      <w:r>
-        <w:rPr>
-          <w:rFonts w:ascii="Times New Roman" w:hAnsi="Times New Roman" w:cs="Times New Roman"/>
-          <w:b/>
-          <w:bCs/>
-          <w:color w:val="000000" w:themeColor="text1"/>
-          <w:sz w:val="20"/>
-          <w:szCs w:val="20"/>
-        </w:rPr>
-        <w:t>contract_num</w:t>
-      </w:r>
-      <w:proofErr w:type="spellEnd"/>
-      <w:r>
-        <w:rPr>
-          <w:rFonts w:ascii="Times New Roman" w:hAnsi="Times New Roman" w:cs="Times New Roman"/>
-          <w:b/>
-          <w:bCs/>
-          <w:color w:val="000000" w:themeColor="text1"/>
-          <w:sz w:val="20"/>
-          <w:szCs w:val="20"/>
-        </w:rPr>
-        <w:t>}}</w:t>
+        <w:t>{{contract_num}}</w:t>
       </w:r>
     </w:p>
     <w:p>
@@ -3330,7 +2980,6 @@
           <w:szCs w:val="20"/>
         </w:rPr>
       </w:pPr>
-      <w:proofErr w:type="gramStart"/>
       <w:r>
         <w:rPr>
           <w:rFonts w:ascii="Times New Roman" w:hAnsi="Times New Roman" w:cs="Times New Roman"/>
@@ -3347,37 +2996,7 @@
           <w:sz w:val="20"/>
           <w:szCs w:val="20"/>
         </w:rPr>
-        <w:t>{</w:t>
-      </w:r>
-      <w:proofErr w:type="gramEnd"/>
-      <w:r>
-        <w:rPr>
-          <w:rFonts w:ascii="Times New Roman" w:hAnsi="Times New Roman" w:cs="Times New Roman"/>
-          <w:color w:val="000000" w:themeColor="text1"/>
-          <w:sz w:val="20"/>
-          <w:szCs w:val="20"/>
-        </w:rPr>
-        <w:t>{</w:t>
-      </w:r>
-      <w:proofErr w:type="spellStart"/>
-      <w:r>
-        <w:rPr>
-          <w:rFonts w:ascii="Times New Roman" w:hAnsi="Times New Roman" w:cs="Times New Roman"/>
-          <w:color w:val="000000" w:themeColor="text1"/>
-          <w:sz w:val="20"/>
-          <w:szCs w:val="20"/>
-        </w:rPr>
-        <w:t>contract_date</w:t>
-      </w:r>
-      <w:proofErr w:type="spellEnd"/>
-      <w:r>
-        <w:rPr>
-          <w:rFonts w:ascii="Times New Roman" w:hAnsi="Times New Roman" w:cs="Times New Roman"/>
-          <w:color w:val="000000" w:themeColor="text1"/>
-          <w:sz w:val="20"/>
-          <w:szCs w:val="20"/>
-        </w:rPr>
-        <w:t>}}</w:t>
+        <w:t>{{contract_date}}</w:t>
       </w:r>
     </w:p>
     <w:p>
@@ -3481,21 +3100,7 @@
               <w:rPr>
                 <w:color w:val="000000" w:themeColor="text1"/>
               </w:rPr>
-              <w:t xml:space="preserve">№ </w:t>
-            </w:r>
-            <w:proofErr w:type="spellStart"/>
-            <w:r>
-              <w:rPr>
-                <w:color w:val="000000" w:themeColor="text1"/>
-              </w:rPr>
-              <w:t>п.п</w:t>
-            </w:r>
-            <w:proofErr w:type="spellEnd"/>
-            <w:r>
-              <w:rPr>
-                <w:color w:val="000000" w:themeColor="text1"/>
-              </w:rPr>
-              <w:t>.</w:t>
+              <w:t>№ п.п.</w:t>
             </w:r>
           </w:p>
         </w:tc>
@@ -3754,15 +3359,7 @@
               <w:t xml:space="preserve">   Двигатель новый </w:t>
             </w:r>
             <w:r>
-              <w:t>{{</w:t>
-            </w:r>
-            <w:proofErr w:type="spellStart"/>
-            <w:r>
-              <w:t>engine_model</w:t>
-            </w:r>
-            <w:proofErr w:type="spellEnd"/>
-            <w:r>
-              <w:t>}}</w:t>
+              <w:t>{{engine_model}}</w:t>
             </w:r>
             <w:r>
               <w:rPr>
@@ -3808,25 +3405,7 @@
                 <w:bCs/>
                 <w:lang w:val="en-US"/>
               </w:rPr>
-              <w:t>{{</w:t>
-            </w:r>
-            <w:proofErr w:type="spellStart"/>
-            <w:r>
-              <w:rPr>
-                <w:b/>
-                <w:bCs/>
-                <w:lang w:val="en-US"/>
-              </w:rPr>
-              <w:t>engine_num</w:t>
-            </w:r>
-            <w:proofErr w:type="spellEnd"/>
-            <w:r>
-              <w:rPr>
-                <w:b/>
-                <w:bCs/>
-                <w:lang w:val="en-US"/>
-              </w:rPr>
-              <w:t>}}</w:t>
+              <w:t>{{engine_num}}</w:t>
             </w:r>
           </w:p>
         </w:tc>
@@ -3887,6 +3466,7 @@
           </w:tcPr>
           <w:p>
             <w:pPr>
+              <w:jc w:val="center"/>
               <w:rPr>
                 <w:color w:val="000000" w:themeColor="text1"/>
               </w:rPr>
@@ -3894,29 +3474,8 @@
             <w:r>
               <w:rPr>
                 <w:color w:val="000000" w:themeColor="text1"/>
-                <w:lang w:val="en-US"/>
-              </w:rPr>
-              <w:t xml:space="preserve">  </w:t>
-            </w:r>
-            <w:r>
-              <w:rPr>
-                <w:color w:val="000000" w:themeColor="text1"/>
-              </w:rPr>
-              <w:t>{{</w:t>
-            </w:r>
-            <w:proofErr w:type="spellStart"/>
-            <w:r>
-              <w:rPr>
-                <w:color w:val="000000" w:themeColor="text1"/>
-              </w:rPr>
-              <w:t>price</w:t>
-            </w:r>
-            <w:proofErr w:type="spellEnd"/>
-            <w:r>
-              <w:rPr>
-                <w:color w:val="000000" w:themeColor="text1"/>
-              </w:rPr>
-              <w:t>}}</w:t>
+              </w:rPr>
+              <w:t>{{price}}</w:t>
             </w:r>
           </w:p>
         </w:tc>
@@ -3939,21 +3498,7 @@
               <w:rPr>
                 <w:color w:val="000000" w:themeColor="text1"/>
               </w:rPr>
-              <w:t>{{</w:t>
-            </w:r>
-            <w:proofErr w:type="spellStart"/>
-            <w:r>
-              <w:rPr>
-                <w:color w:val="000000" w:themeColor="text1"/>
-              </w:rPr>
-              <w:t>price</w:t>
-            </w:r>
-            <w:proofErr w:type="spellEnd"/>
-            <w:r>
-              <w:rPr>
-                <w:color w:val="000000" w:themeColor="text1"/>
-              </w:rPr>
-              <w:t>}}</w:t>
+              <w:t>{{price}}</w:t>
             </w:r>
           </w:p>
         </w:tc>
@@ -4028,27 +3573,7 @@
           <w:bCs/>
           <w:color w:val="000000" w:themeColor="text1"/>
         </w:rPr>
-        <w:t>{{</w:t>
-      </w:r>
-      <w:proofErr w:type="spellStart"/>
-      <w:r>
-        <w:rPr>
-          <w:rFonts w:ascii="Times New Roman" w:hAnsi="Times New Roman" w:cs="Times New Roman"/>
-          <w:b/>
-          <w:bCs/>
-          <w:color w:val="000000" w:themeColor="text1"/>
-        </w:rPr>
-        <w:t>price</w:t>
-      </w:r>
-      <w:proofErr w:type="spellEnd"/>
-      <w:r>
-        <w:rPr>
-          <w:rFonts w:ascii="Times New Roman" w:hAnsi="Times New Roman" w:cs="Times New Roman"/>
-          <w:b/>
-          <w:bCs/>
-          <w:color w:val="000000" w:themeColor="text1"/>
-        </w:rPr>
-        <w:t xml:space="preserve">}} </w:t>
+        <w:t xml:space="preserve">{{price}} </w:t>
       </w:r>
       <w:r>
         <w:rPr>
@@ -4117,27 +3642,7 @@
           <w:sz w:val="20"/>
           <w:szCs w:val="20"/>
         </w:rPr>
-        <w:t>{{</w:t>
-      </w:r>
-      <w:proofErr w:type="spellStart"/>
-      <w:r>
-        <w:rPr>
-          <w:rFonts w:ascii="Times New Roman" w:hAnsi="Times New Roman" w:cs="Times New Roman"/>
-          <w:color w:val="000000" w:themeColor="text1"/>
-          <w:sz w:val="20"/>
-          <w:szCs w:val="20"/>
-        </w:rPr>
-        <w:t>contract_num</w:t>
-      </w:r>
-      <w:proofErr w:type="spellEnd"/>
-      <w:r>
-        <w:rPr>
-          <w:rFonts w:ascii="Times New Roman" w:hAnsi="Times New Roman" w:cs="Times New Roman"/>
-          <w:color w:val="000000" w:themeColor="text1"/>
-          <w:sz w:val="20"/>
-          <w:szCs w:val="20"/>
-        </w:rPr>
-        <w:t>}}</w:t>
+        <w:t>{{contract_num}}</w:t>
       </w:r>
       <w:r>
         <w:rPr>
@@ -4163,25 +3668,7 @@
           <w:sz w:val="20"/>
           <w:szCs w:val="20"/>
         </w:rPr>
-        <w:t>{{</w:t>
-      </w:r>
-      <w:proofErr w:type="spellStart"/>
-      <w:r>
-        <w:rPr>
-          <w:rFonts w:ascii="Times New Roman" w:hAnsi="Times New Roman" w:cs="Times New Roman"/>
-          <w:sz w:val="20"/>
-          <w:szCs w:val="20"/>
-        </w:rPr>
-        <w:t>contract_date</w:t>
-      </w:r>
-      <w:proofErr w:type="spellEnd"/>
-      <w:r>
-        <w:rPr>
-          <w:rFonts w:ascii="Times New Roman" w:hAnsi="Times New Roman" w:cs="Times New Roman"/>
-          <w:sz w:val="20"/>
-          <w:szCs w:val="20"/>
-        </w:rPr>
-        <w:t>}}</w:t>
+        <w:t>{{contract_date}}</w:t>
       </w:r>
     </w:p>
     <w:p>
@@ -4422,14 +3909,12 @@
                 <w:color w:val="000000" w:themeColor="text1"/>
               </w:rPr>
             </w:pPr>
-            <w:proofErr w:type="gramStart"/>
             <w:r>
               <w:rPr>
                 <w:color w:val="000000" w:themeColor="text1"/>
               </w:rPr>
               <w:t>ОГРН  304667004400114</w:t>
             </w:r>
-            <w:proofErr w:type="gramEnd"/>
           </w:p>
           <w:p>
             <w:pPr>
@@ -4506,27 +3991,11 @@
                 <w:color w:val="000000" w:themeColor="text1"/>
               </w:rPr>
             </w:pPr>
-            <w:proofErr w:type="spellStart"/>
-            <w:proofErr w:type="gramStart"/>
             <w:r>
               <w:rPr>
                 <w:color w:val="000000" w:themeColor="text1"/>
               </w:rPr>
-              <w:t>обл</w:t>
-            </w:r>
-            <w:proofErr w:type="spellEnd"/>
-            <w:r>
-              <w:rPr>
-                <w:color w:val="000000" w:themeColor="text1"/>
-              </w:rPr>
-              <w:t>,  город</w:t>
-            </w:r>
-            <w:proofErr w:type="gramEnd"/>
-            <w:r>
-              <w:rPr>
-                <w:color w:val="000000" w:themeColor="text1"/>
-              </w:rPr>
-              <w:t xml:space="preserve"> Екатеринбург, ул. Бабушкина, д. 45</w:t>
+              <w:t>обл,  город Екатеринбург, ул. Бабушкина, д. 45</w:t>
             </w:r>
           </w:p>
           <w:p>
@@ -4548,27 +4017,11 @@
                 <w:color w:val="000000" w:themeColor="text1"/>
               </w:rPr>
             </w:pPr>
-            <w:proofErr w:type="spellStart"/>
-            <w:proofErr w:type="gramStart"/>
             <w:r>
               <w:rPr>
                 <w:color w:val="000000" w:themeColor="text1"/>
               </w:rPr>
-              <w:t>обл</w:t>
-            </w:r>
-            <w:proofErr w:type="spellEnd"/>
-            <w:r>
-              <w:rPr>
-                <w:color w:val="000000" w:themeColor="text1"/>
-              </w:rPr>
-              <w:t>,  город</w:t>
-            </w:r>
-            <w:proofErr w:type="gramEnd"/>
-            <w:r>
-              <w:rPr>
-                <w:color w:val="000000" w:themeColor="text1"/>
-              </w:rPr>
-              <w:t xml:space="preserve"> Екатеринбург, ул. Фронтовых Бригад, д. 18</w:t>
+              <w:t>обл,  город Екатеринбург, ул. Фронтовых Бригад, д. 18</w:t>
             </w:r>
             <w:r>
               <w:rPr>
@@ -4769,16 +4222,117 @@
               <w:rPr>
                 <w:color w:val="000000" w:themeColor="text1"/>
               </w:rPr>
-              <w:t>{{</w:t>
+              <w:t>{{fio}}</w:t>
             </w:r>
-            <w:proofErr w:type="spellStart"/>
+          </w:p>
+          <w:p>
+            <w:pPr>
+              <w:rPr>
+                <w:color w:val="000000" w:themeColor="text1"/>
+              </w:rPr>
+            </w:pPr>
             <w:r>
               <w:rPr>
                 <w:color w:val="000000" w:themeColor="text1"/>
               </w:rPr>
-              <w:t>fio</w:t>
+              <w:t>Паспорт</w:t>
             </w:r>
-            <w:proofErr w:type="spellEnd"/>
+            <w:r>
+              <w:rPr>
+                <w:color w:val="000000" w:themeColor="text1"/>
+              </w:rPr>
+              <w:t>: {{</w:t>
+            </w:r>
+            <w:r>
+              <w:rPr>
+                <w:color w:val="000000" w:themeColor="text1"/>
+                <w:lang w:val="en-US"/>
+              </w:rPr>
+              <w:t>passport</w:t>
+            </w:r>
+            <w:r>
+              <w:rPr>
+                <w:color w:val="000000" w:themeColor="text1"/>
+              </w:rPr>
+              <w:t>_</w:t>
+            </w:r>
+            <w:r>
+              <w:rPr>
+                <w:color w:val="000000" w:themeColor="text1"/>
+                <w:lang w:val="en-US"/>
+              </w:rPr>
+              <w:t>series</w:t>
+            </w:r>
+            <w:r>
+              <w:rPr>
+                <w:color w:val="000000" w:themeColor="text1"/>
+              </w:rPr>
+              <w:t>}} {{</w:t>
+            </w:r>
+            <w:r>
+              <w:rPr>
+                <w:color w:val="000000" w:themeColor="text1"/>
+                <w:lang w:val="en-US"/>
+              </w:rPr>
+              <w:t>passport</w:t>
+            </w:r>
+            <w:r>
+              <w:rPr>
+                <w:color w:val="000000" w:themeColor="text1"/>
+              </w:rPr>
+              <w:t>_</w:t>
+            </w:r>
+            <w:r>
+              <w:rPr>
+                <w:color w:val="000000" w:themeColor="text1"/>
+                <w:lang w:val="en-US"/>
+              </w:rPr>
+              <w:t>num</w:t>
+            </w:r>
+            <w:r>
+              <w:rPr>
+                <w:color w:val="000000" w:themeColor="text1"/>
+              </w:rPr>
+              <w:t>}}</w:t>
+            </w:r>
+            <w:r>
+              <w:rPr>
+                <w:color w:val="000000" w:themeColor="text1"/>
+              </w:rPr>
+              <w:br/>
+            </w:r>
+            <w:r>
+              <w:rPr>
+                <w:color w:val="000000" w:themeColor="text1"/>
+              </w:rPr>
+              <w:t>Выдан</w:t>
+            </w:r>
+            <w:r>
+              <w:rPr>
+                <w:color w:val="000000" w:themeColor="text1"/>
+              </w:rPr>
+              <w:t>: {{</w:t>
+            </w:r>
+            <w:r>
+              <w:rPr>
+                <w:color w:val="000000" w:themeColor="text1"/>
+                <w:lang w:val="en-US"/>
+              </w:rPr>
+              <w:t>passport</w:t>
+            </w:r>
+            <w:r>
+              <w:rPr>
+                <w:color w:val="000000" w:themeColor="text1"/>
+              </w:rPr>
+              <w:t>_</w:t>
+            </w:r>
+            <w:r>
+              <w:rPr>
+                <w:color w:val="000000" w:themeColor="text1"/>
+                <w:lang w:val="en-US"/>
+              </w:rPr>
+              <w:t>issued</w:t>
+            </w:r>
             <w:r>
               <w:rPr>
                 <w:color w:val="000000" w:themeColor="text1"/>
@@ -4796,7 +4350,19 @@
               <w:rPr>
                 <w:color w:val="000000" w:themeColor="text1"/>
               </w:rPr>
-              <w:t>Паспорт</w:t>
+              <w:t>Код</w:t>
+            </w:r>
+            <w:r>
+              <w:rPr>
+                <w:color w:val="000000" w:themeColor="text1"/>
+              </w:rPr>
+              <w:t xml:space="preserve"> </w:t>
+            </w:r>
+            <w:r>
+              <w:rPr>
+                <w:color w:val="000000" w:themeColor="text1"/>
+              </w:rPr>
+              <w:t>подразделения</w:t>
             </w:r>
             <w:r>
               <w:rPr>
@@ -4822,77 +4388,7 @@
                 <w:color w:val="000000" w:themeColor="text1"/>
                 <w:lang w:val="en-US"/>
               </w:rPr>
-              <w:t>series</w:t>
-            </w:r>
-            <w:r>
-              <w:rPr>
-                <w:color w:val="000000" w:themeColor="text1"/>
-              </w:rPr>
-              <w:t>}} {{</w:t>
-            </w:r>
-            <w:r>
-              <w:rPr>
-                <w:color w:val="000000" w:themeColor="text1"/>
-                <w:lang w:val="en-US"/>
-              </w:rPr>
-              <w:t>passport</w:t>
-            </w:r>
-            <w:r>
-              <w:rPr>
-                <w:color w:val="000000" w:themeColor="text1"/>
-              </w:rPr>
-              <w:t>_</w:t>
-            </w:r>
-            <w:r>
-              <w:rPr>
-                <w:color w:val="000000" w:themeColor="text1"/>
-                <w:lang w:val="en-US"/>
-              </w:rPr>
-              <w:t>num</w:t>
-            </w:r>
-            <w:r>
-              <w:rPr>
-                <w:color w:val="000000" w:themeColor="text1"/>
-              </w:rPr>
-              <w:t>}}</w:t>
-            </w:r>
-            <w:r>
-              <w:rPr>
-                <w:color w:val="000000" w:themeColor="text1"/>
-              </w:rPr>
-              <w:br/>
-            </w:r>
-            <w:r>
-              <w:rPr>
-                <w:color w:val="000000" w:themeColor="text1"/>
-              </w:rPr>
-              <w:t>Выдан</w:t>
-            </w:r>
-            <w:r>
-              <w:rPr>
-                <w:color w:val="000000" w:themeColor="text1"/>
-              </w:rPr>
-              <w:t>: {{</w:t>
-            </w:r>
-            <w:r>
-              <w:rPr>
-                <w:color w:val="000000" w:themeColor="text1"/>
-                <w:lang w:val="en-US"/>
-              </w:rPr>
-              <w:t>passport</w:t>
-            </w:r>
-            <w:r>
-              <w:rPr>
-                <w:color w:val="000000" w:themeColor="text1"/>
-              </w:rPr>
-              <w:t>_</w:t>
-            </w:r>
-            <w:r>
-              <w:rPr>
-                <w:color w:val="000000" w:themeColor="text1"/>
-                <w:lang w:val="en-US"/>
-              </w:rPr>
-              <w:t>issued</w:t>
+              <w:t>code</w:t>
             </w:r>
             <w:r>
               <w:rPr>
@@ -4909,64 +4405,6 @@
             </w:pPr>
             <w:r>
               <w:rPr>
-                <w:color w:val="000000" w:themeColor="text1"/>
-              </w:rPr>
-              <w:t>Код</w:t>
-            </w:r>
-            <w:r>
-              <w:rPr>
-                <w:color w:val="000000" w:themeColor="text1"/>
-              </w:rPr>
-              <w:t xml:space="preserve"> </w:t>
-            </w:r>
-            <w:r>
-              <w:rPr>
-                <w:color w:val="000000" w:themeColor="text1"/>
-              </w:rPr>
-              <w:t>подразделения</w:t>
-            </w:r>
-            <w:r>
-              <w:rPr>
-                <w:color w:val="000000" w:themeColor="text1"/>
-              </w:rPr>
-              <w:t>: {{</w:t>
-            </w:r>
-            <w:r>
-              <w:rPr>
-                <w:color w:val="000000" w:themeColor="text1"/>
-                <w:lang w:val="en-US"/>
-              </w:rPr>
-              <w:t>passport</w:t>
-            </w:r>
-            <w:r>
-              <w:rPr>
-                <w:color w:val="000000" w:themeColor="text1"/>
-              </w:rPr>
-              <w:t>_</w:t>
-            </w:r>
-            <w:r>
-              <w:rPr>
-                <w:color w:val="000000" w:themeColor="text1"/>
-                <w:lang w:val="en-US"/>
-              </w:rPr>
-              <w:t>code</w:t>
-            </w:r>
-            <w:r>
-              <w:rPr>
-                <w:color w:val="000000" w:themeColor="text1"/>
-              </w:rPr>
-              <w:t>}}</w:t>
-            </w:r>
-          </w:p>
-          <w:p>
-            <w:pPr>
-              <w:rPr>
-                <w:color w:val="000000" w:themeColor="text1"/>
-              </w:rPr>
-            </w:pPr>
-            <w:proofErr w:type="gramStart"/>
-            <w:r>
-              <w:rPr>
                 <w:color w:val="000000"/>
               </w:rPr>
               <w:t>Адрес</w:t>
@@ -4975,14 +4413,7 @@
               <w:rPr>
                 <w:color w:val="000000"/>
               </w:rPr>
-              <w:t>:  {</w:t>
-            </w:r>
-            <w:proofErr w:type="gramEnd"/>
-            <w:r>
-              <w:rPr>
-                <w:color w:val="000000"/>
-              </w:rPr>
-              <w:t>{</w:t>
+              <w:t>:  {{</w:t>
             </w:r>
             <w:r>
               <w:rPr>

</xml_diff>